<commit_message>
completed till shedulers and their configs
</commit_message>
<xml_diff>
--- a/docs (kubernetes)/kcna_kodekloud.docx
+++ b/docs (kubernetes)/kcna_kodekloud.docx
@@ -18986,7 +18986,26 @@
             </w14:solidFill>
           </w14:textFill>
         </w:rPr>
-        <w:t>Toleate the Pod</w:t>
+        <w:t>Toler</w:t>
+      </w:r>
+      <w:bookmarkStart w:id="0" w:name="_GoBack"/>
+      <w:bookmarkEnd w:id="0"/>
+      <w:r>
+        <w:rPr>
+          <w:rFonts w:hint="default" w:ascii="Bodoni MT" w:hAnsi="Bodoni MT" w:cs="Bodoni MT"/>
+          <w:b/>
+          <w:bCs/>
+          <w:color w:val="FFFFFF" w:themeColor="background1"/>
+          <w:highlight w:val="darkMagenta"/>
+          <w:u w:val="single"/>
+          <w:lang w:val="en-IN"/>
+          <w14:textFill>
+            <w14:solidFill>
+              <w14:schemeClr w14:val="bg1"/>
+            </w14:solidFill>
+          </w14:textFill>
+        </w:rPr>
+        <w:t>ate the Pod</w:t>
       </w:r>
       <w:r>
         <w:rPr>
@@ -26129,8 +26148,8 @@
         </w:rPr>
         <w:drawing>
           <wp:inline distT="0" distB="0" distL="114300" distR="114300">
-            <wp:extent cx="3620770" cy="3113405"/>
-            <wp:effectExtent l="0" t="0" r="11430" b="10795"/>
+            <wp:extent cx="3006725" cy="2585720"/>
+            <wp:effectExtent l="0" t="0" r="3175" b="5080"/>
             <wp:docPr id="143" name="Picture 142"/>
             <wp:cNvGraphicFramePr>
               <a:graphicFrameLocks xmlns:a="http://schemas.openxmlformats.org/drawingml/2006/main" noChangeAspect="1"/>
@@ -26153,7 +26172,7 @@
                   <pic:spPr>
                     <a:xfrm>
                       <a:off x="0" y="0"/>
-                      <a:ext cx="3620770" cy="3113405"/>
+                      <a:ext cx="3006725" cy="2585720"/>
                     </a:xfrm>
                     <a:prstGeom prst="rect">
                       <a:avLst/>
@@ -27172,8 +27191,8 @@
         </w:rPr>
         <w:drawing>
           <wp:inline distT="0" distB="0" distL="114300" distR="114300">
-            <wp:extent cx="2606675" cy="3604260"/>
-            <wp:effectExtent l="0" t="0" r="9525" b="2540"/>
+            <wp:extent cx="2228850" cy="3082290"/>
+            <wp:effectExtent l="0" t="0" r="6350" b="3810"/>
             <wp:docPr id="144" name="Picture 143"/>
             <wp:cNvGraphicFramePr>
               <a:graphicFrameLocks xmlns:a="http://schemas.openxmlformats.org/drawingml/2006/main" noChangeAspect="1"/>
@@ -27196,7 +27215,7 @@
                   <pic:spPr>
                     <a:xfrm>
                       <a:off x="0" y="0"/>
-                      <a:ext cx="2606675" cy="3604260"/>
+                      <a:ext cx="2228850" cy="3082290"/>
                     </a:xfrm>
                     <a:prstGeom prst="rect">
                       <a:avLst/>
@@ -27276,6 +27295,7 @@
         <w:keepLines w:val="0"/>
         <w:widowControl/>
         <w:numPr>
+          <w:ilvl w:val="0"/>
           <w:numId w:val="0"/>
         </w:numPr>
         <w:suppressLineNumbers w:val="0"/>
@@ -29011,6 +29031,7 @@
         <w:keepLines w:val="0"/>
         <w:widowControl/>
         <w:numPr>
+          <w:ilvl w:val="0"/>
           <w:numId w:val="0"/>
         </w:numPr>
         <w:suppressLineNumbers w:val="0"/>
@@ -29186,7 +29207,7 @@
       </w:r>
       <w:r>
         <w:rPr>
-          <w:rFonts w:hint="default" w:ascii="Calibri" w:hAnsi="Calibri" w:eastAsia="SimSun" w:cs="Bodoni MT"/>
+          <w:rFonts w:hint="default" w:ascii="Bodoni MT" w:hAnsi="Bodoni MT" w:eastAsia="SimSun" w:cs="Bodoni MT"/>
           <w:color w:val="3B5F21" w:themeColor="accent4" w:themeShade="80"/>
           <w:kern w:val="0"/>
           <w:sz w:val="22"/>
@@ -29386,6 +29407,7 @@
         <w:keepLines w:val="0"/>
         <w:widowControl/>
         <w:numPr>
+          <w:ilvl w:val="0"/>
           <w:numId w:val="0"/>
         </w:numPr>
         <w:suppressLineNumbers w:val="0"/>
@@ -29418,6 +29440,7 @@
         <w:keepLines w:val="0"/>
         <w:widowControl/>
         <w:numPr>
+          <w:ilvl w:val="0"/>
           <w:numId w:val="0"/>
         </w:numPr>
         <w:suppressLineNumbers w:val="0"/>
@@ -32058,6 +32081,9 @@
         <w:br w:type="textWrapping"/>
       </w:r>
       <w:r>
+        <w:rPr>
+          <w:rFonts w:hint="default" w:ascii="Bodoni MT" w:hAnsi="Bodoni MT" w:cs="Bodoni MT"/>
+        </w:rPr>
         <w:drawing>
           <wp:inline distT="0" distB="0" distL="114300" distR="114300">
             <wp:extent cx="5272405" cy="636905"/>
@@ -32120,14 +32146,14 @@
       </w:pPr>
       <w:r>
         <w:rPr>
-          <w:rFonts w:hint="default" w:ascii="Bodoni MT"/>
+          <w:rFonts w:hint="default" w:ascii="Bodoni MT" w:hAnsi="Bodoni MT" w:cs="Bodoni MT"/>
           <w:lang w:val="en-IN"/>
         </w:rPr>
         <w:t xml:space="preserve">The below is the </w:t>
       </w:r>
       <w:r>
         <w:rPr>
-          <w:rFonts w:hint="default" w:ascii="Bodoni MT"/>
+          <w:rFonts w:hint="default" w:ascii="Bodoni MT" w:hAnsi="Bodoni MT" w:cs="Bodoni MT"/>
           <w:i/>
           <w:iCs/>
           <w:lang w:val="en-IN"/>
@@ -32136,7 +32162,7 @@
       </w:r>
       <w:r>
         <w:rPr>
-          <w:rFonts w:hint="default" w:ascii="Bodoni MT"/>
+          <w:rFonts w:hint="default" w:ascii="Bodoni MT" w:hAnsi="Bodoni MT" w:cs="Bodoni MT"/>
           <w:i w:val="0"/>
           <w:iCs w:val="0"/>
           <w:lang w:val="en-IN"/>
@@ -32145,7 +32171,7 @@
       </w:r>
       <w:r>
         <w:rPr>
-          <w:rFonts w:hint="default" w:ascii="Bodoni MT"/>
+          <w:rFonts w:hint="default" w:ascii="Bodoni MT" w:hAnsi="Bodoni MT" w:cs="Bodoni MT"/>
           <w:b/>
           <w:bCs/>
           <w:i/>
@@ -32156,7 +32182,7 @@
       </w:r>
       <w:r>
         <w:rPr>
-          <w:rFonts w:hint="default" w:ascii="Bodoni MT"/>
+          <w:rFonts w:hint="default" w:ascii="Bodoni MT" w:hAnsi="Bodoni MT" w:cs="Bodoni MT"/>
           <w:b w:val="0"/>
           <w:bCs w:val="0"/>
           <w:i w:val="0"/>
@@ -32167,7 +32193,7 @@
       </w:r>
       <w:r>
         <w:rPr>
-          <w:rFonts w:hint="default" w:ascii="Bodoni MT"/>
+          <w:rFonts w:hint="default" w:ascii="Bodoni MT" w:hAnsi="Bodoni MT" w:cs="Bodoni MT"/>
           <w:b w:val="0"/>
           <w:bCs w:val="0"/>
           <w:i w:val="0"/>
@@ -32177,6 +32203,9 @@
         <w:br w:type="textWrapping"/>
       </w:r>
       <w:r>
+        <w:rPr>
+          <w:rFonts w:hint="default" w:ascii="Bodoni MT" w:hAnsi="Bodoni MT" w:cs="Bodoni MT"/>
+        </w:rPr>
         <w:drawing>
           <wp:inline distT="0" distB="0" distL="114300" distR="114300">
             <wp:extent cx="5272405" cy="1162685"/>
@@ -32239,21 +32268,21 @@
       </w:pPr>
       <w:r>
         <w:rPr>
-          <w:rFonts w:hint="default" w:ascii="Bodoni MT"/>
+          <w:rFonts w:hint="default" w:ascii="Bodoni MT" w:hAnsi="Bodoni MT" w:cs="Bodoni MT"/>
           <w:lang w:val="en-IN"/>
         </w:rPr>
         <w:t>You can see 2 key value pairs:</w:t>
       </w:r>
       <w:r>
         <w:rPr>
-          <w:rFonts w:hint="default" w:ascii="Bodoni MT"/>
+          <w:rFonts w:hint="default" w:ascii="Bodoni MT" w:hAnsi="Bodoni MT" w:cs="Bodoni MT"/>
           <w:lang w:val="en-IN"/>
         </w:rPr>
         <w:br w:type="textWrapping"/>
       </w:r>
       <w:r>
         <w:rPr>
-          <w:rFonts w:hint="default" w:ascii="Bodoni MT"/>
+          <w:rFonts w:hint="default" w:ascii="Bodoni MT" w:hAnsi="Bodoni MT" w:cs="Bodoni MT"/>
           <w:b/>
           <w:bCs/>
           <w:lang w:val="en-IN"/>
@@ -32262,7 +32291,7 @@
       </w:r>
       <w:r>
         <w:rPr>
-          <w:rFonts w:hint="default" w:ascii="Bodoni MT"/>
+          <w:rFonts w:hint="default" w:ascii="Bodoni MT" w:hAnsi="Bodoni MT" w:cs="Bodoni MT"/>
           <w:b w:val="0"/>
           <w:bCs w:val="0"/>
           <w:lang w:val="en-IN"/>
@@ -32271,7 +32300,7 @@
       </w:r>
       <w:r>
         <w:rPr>
-          <w:rFonts w:hint="default" w:ascii="Bodoni MT"/>
+          <w:rFonts w:hint="default" w:ascii="Bodoni MT" w:hAnsi="Bodoni MT" w:cs="Bodoni MT"/>
           <w:b/>
           <w:bCs/>
           <w:lang w:val="en-IN"/>
@@ -32280,7 +32309,7 @@
       </w:r>
       <w:r>
         <w:rPr>
-          <w:rFonts w:hint="default" w:ascii="Bodoni MT"/>
+          <w:rFonts w:hint="default" w:ascii="Bodoni MT" w:hAnsi="Bodoni MT" w:cs="Bodoni MT"/>
           <w:b/>
           <w:bCs/>
           <w:lang w:val="en-IN"/>
@@ -32289,7 +32318,7 @@
       </w:r>
       <w:r>
         <w:rPr>
-          <w:rFonts w:hint="default" w:ascii="Bodoni MT"/>
+          <w:rFonts w:hint="default" w:ascii="Bodoni MT" w:hAnsi="Bodoni MT" w:cs="Bodoni MT"/>
           <w:b/>
           <w:bCs/>
           <w:lang w:val="en-IN"/>
@@ -32298,7 +32327,7 @@
       </w:r>
       <w:r>
         <w:rPr>
-          <w:rFonts w:hint="default" w:ascii="Bodoni MT"/>
+          <w:rFonts w:hint="default" w:ascii="Bodoni MT" w:hAnsi="Bodoni MT" w:cs="Bodoni MT"/>
           <w:b/>
           <w:bCs/>
           <w:lang w:val="en-IN"/>
@@ -32307,7 +32336,7 @@
       </w:r>
       <w:r>
         <w:rPr>
-          <w:rFonts w:hint="default" w:ascii="Bodoni MT"/>
+          <w:rFonts w:hint="default" w:ascii="Bodoni MT" w:hAnsi="Bodoni MT" w:cs="Bodoni MT"/>
           <w:b w:val="0"/>
           <w:bCs w:val="0"/>
           <w:lang w:val="en-IN"/>
@@ -32316,7 +32345,7 @@
       </w:r>
       <w:r>
         <w:rPr>
-          <w:rFonts w:hint="default" w:ascii="Bodoni MT"/>
+          <w:rFonts w:hint="default" w:ascii="Bodoni MT" w:hAnsi="Bodoni MT" w:cs="Bodoni MT"/>
           <w:b w:val="0"/>
           <w:bCs w:val="0"/>
           <w:color w:val="18605A" w:themeColor="accent5" w:themeShade="80"/>
@@ -32327,7 +32356,7 @@
       </w:r>
       <w:r>
         <w:rPr>
-          <w:rFonts w:hint="default" w:ascii="Bodoni MT"/>
+          <w:rFonts w:hint="default" w:ascii="Bodoni MT" w:hAnsi="Bodoni MT" w:cs="Bodoni MT"/>
           <w:b w:val="0"/>
           <w:bCs w:val="0"/>
           <w:i/>
@@ -32340,7 +32369,7 @@
       </w:r>
       <w:r>
         <w:rPr>
-          <w:rFonts w:hint="default" w:ascii="Bodoni MT"/>
+          <w:rFonts w:hint="default" w:ascii="Bodoni MT" w:hAnsi="Bodoni MT" w:cs="Bodoni MT"/>
           <w:b w:val="0"/>
           <w:bCs w:val="0"/>
           <w:i w:val="0"/>
@@ -32645,18 +32674,25 @@
           <w:rFonts w:hint="default" w:ascii="Bodoni MT" w:hAnsi="Bodoni MT" w:cs="Bodoni MT"/>
         </w:rPr>
       </w:pPr>
-      <w:r>
-        <w:rPr>
-          <w:rFonts w:hint="default" w:ascii="Bodoni MT" w:hAnsi="Bodoni MT" w:cs="Bodoni MT"/>
-          <w:lang w:val="en-IN"/>
-        </w:rPr>
-        <w:t>F</w:t>
-      </w:r>
     </w:p>
     <w:p>
       <w:pPr>
         <w:rPr>
           <w:rFonts w:hint="default" w:ascii="Bodoni MT" w:hAnsi="Bodoni MT" w:cs="Bodoni MT"/>
+          <w:b/>
+          <w:bCs/>
+          <w:i/>
+          <w:iCs/>
+          <w:color w:val="EE822F" w:themeColor="accent2"/>
+          <w:highlight w:val="darkBlue"/>
+          <w:u w:val="single"/>
+          <w:shd w:val="clear" w:color="FFFFFF" w:fill="D9D9D9"/>
+          <w:lang w:val="en-IN"/>
+          <w14:textFill>
+            <w14:solidFill>
+              <w14:schemeClr w14:val="accent2"/>
+            </w14:solidFill>
+          </w14:textFill>
         </w:rPr>
       </w:pPr>
       <w:r>
@@ -32673,6 +32709,7 @@
         <w:keepLines w:val="0"/>
         <w:widowControl/>
         <w:numPr>
+          <w:ilvl w:val="0"/>
           <w:numId w:val="0"/>
         </w:numPr>
         <w:suppressLineNumbers w:val="0"/>
@@ -32685,29 +32722,80 @@
           <w:bCs/>
           <w:i/>
           <w:iCs/>
-          <w:color w:val="002060"/>
-          <w:sz w:val="40"/>
-          <w:szCs w:val="40"/>
-          <w:highlight w:val="lightGray"/>
+          <w:color w:val="EE822F" w:themeColor="accent2"/>
+          <w:sz w:val="28"/>
+          <w:szCs w:val="28"/>
+          <w:highlight w:val="none"/>
           <w:u w:val="single"/>
-          <w:lang w:val="en-IN"/>
-        </w:rPr>
-      </w:pPr>
-      <w:r>
-        <w:rPr>
-          <w:rFonts w:hint="default" w:ascii="Bodoni MT" w:hAnsi="Bodoni MT" w:cs="Bodoni MT"/>
-          <w:b/>
-          <w:bCs/>
-          <w:i/>
-          <w:iCs/>
-          <w:color w:val="002060"/>
-          <w:sz w:val="40"/>
-          <w:szCs w:val="40"/>
-          <w:highlight w:val="lightGray"/>
+          <w:shd w:val="clear" w:color="FFFFFF" w:fill="D9D9D9"/>
+          <w:lang w:val="en-IN"/>
+          <w14:textFill>
+            <w14:solidFill>
+              <w14:schemeClr w14:val="accent2"/>
+            </w14:solidFill>
+          </w14:textFill>
+        </w:rPr>
+      </w:pPr>
+      <w:r>
+        <w:rPr>
+          <w:rFonts w:hint="default" w:ascii="Bodoni MT" w:hAnsi="Bodoni MT" w:cs="Bodoni MT"/>
+          <w:b/>
+          <w:bCs/>
+          <w:i/>
+          <w:iCs/>
+          <w:color w:val="EE822F" w:themeColor="accent2"/>
+          <w:sz w:val="28"/>
+          <w:szCs w:val="28"/>
+          <w:highlight w:val="none"/>
           <w:u w:val="single"/>
-          <w:lang w:val="en-IN"/>
-        </w:rPr>
-        <w:t>-----     Multiple Schedulers     -----</w:t>
+          <w:shd w:val="clear" w:color="FFFFFF" w:fill="D9D9D9"/>
+          <w:lang w:val="en-IN"/>
+          <w14:textFill>
+            <w14:solidFill>
+              <w14:schemeClr w14:val="accent2"/>
+            </w14:solidFill>
+          </w14:textFill>
+        </w:rPr>
+        <w:t xml:space="preserve">___Resources inside Pods </w:t>
+      </w:r>
+      <w:r>
+        <w:rPr>
+          <w:rFonts w:hint="default" w:ascii="Bodoni MT" w:hAnsi="Bodoni MT" w:cs="Bodoni MT"/>
+          <w:b/>
+          <w:bCs/>
+          <w:i/>
+          <w:iCs/>
+          <w:color w:val="auto"/>
+          <w:sz w:val="28"/>
+          <w:szCs w:val="28"/>
+          <w:highlight w:val="none"/>
+          <w:u w:val="single"/>
+          <w:shd w:val="clear" w:color="FFFFFF" w:fill="D9D9D9"/>
+          <w:lang w:val="en-IN"/>
+        </w:rPr>
+        <w:t>vs</w:t>
+      </w:r>
+      <w:r>
+        <w:rPr>
+          <w:rFonts w:hint="default" w:ascii="Bodoni MT" w:hAnsi="Bodoni MT" w:cs="Bodoni MT"/>
+          <w:b/>
+          <w:bCs/>
+          <w:i/>
+          <w:iCs/>
+          <w:color w:val="EE822F" w:themeColor="accent2"/>
+          <w:sz w:val="28"/>
+          <w:szCs w:val="28"/>
+          <w:highlight w:val="none"/>
+          <w:u w:val="single"/>
+          <w:shd w:val="clear" w:color="FFFFFF" w:fill="D9D9D9"/>
+          <w:lang w:val="en-IN"/>
+          <w14:textFill>
+            <w14:solidFill>
+              <w14:schemeClr w14:val="accent2"/>
+            </w14:solidFill>
+          </w14:textFill>
+        </w:rPr>
+        <w:t xml:space="preserve"> Resources as normal Processes___</w:t>
       </w:r>
     </w:p>
     <w:p>
@@ -32732,7 +32820,121 @@
           <w:rFonts w:hint="default" w:ascii="Bodoni MT" w:hAnsi="Bodoni MT" w:cs="Bodoni MT"/>
           <w:lang w:val="en-IN"/>
         </w:rPr>
-        <w:t>F</w:t>
+        <w:t xml:space="preserve">As we saw the control plane processes run in </w:t>
+      </w:r>
+      <w:r>
+        <w:rPr>
+          <w:rFonts w:hint="default" w:ascii="Bodoni MT" w:hAnsi="Bodoni MT" w:cs="Bodoni MT"/>
+          <w:b/>
+          <w:bCs/>
+          <w:i/>
+          <w:iCs/>
+          <w:lang w:val="en-IN"/>
+        </w:rPr>
+        <w:t>static pods</w:t>
+      </w:r>
+      <w:r>
+        <w:rPr>
+          <w:rFonts w:hint="default" w:ascii="Bodoni MT" w:hAnsi="Bodoni MT" w:cs="Bodoni MT"/>
+          <w:b w:val="0"/>
+          <w:bCs w:val="0"/>
+          <w:i w:val="0"/>
+          <w:iCs w:val="0"/>
+          <w:lang w:val="en-IN"/>
+        </w:rPr>
+        <w:t xml:space="preserve"> in the control plane node when you configure the cluster via </w:t>
+      </w:r>
+      <w:r>
+        <w:rPr>
+          <w:rFonts w:hint="default" w:ascii="Bodoni MT" w:hAnsi="Bodoni MT" w:cs="Bodoni MT"/>
+          <w:b/>
+          <w:bCs/>
+          <w:i/>
+          <w:iCs/>
+          <w:lang w:val="en-IN"/>
+        </w:rPr>
+        <w:t>kubeadm</w:t>
+      </w:r>
+      <w:r>
+        <w:rPr>
+          <w:rFonts w:hint="default" w:ascii="Bodoni MT" w:hAnsi="Bodoni MT" w:cs="Bodoni MT"/>
+          <w:b w:val="0"/>
+          <w:bCs w:val="0"/>
+          <w:i w:val="0"/>
+          <w:iCs w:val="0"/>
+          <w:lang w:val="en-IN"/>
+        </w:rPr>
+        <w:t xml:space="preserve">, </w:t>
+      </w:r>
+      <w:r>
+        <w:rPr>
+          <w:rFonts w:hint="default" w:ascii="Bodoni MT" w:hAnsi="Bodoni MT" w:cs="Bodoni MT"/>
+          <w:b w:val="0"/>
+          <w:bCs w:val="0"/>
+          <w:i w:val="0"/>
+          <w:iCs w:val="0"/>
+          <w:color w:val="C81D31" w:themeColor="accent6" w:themeShade="BF"/>
+          <w:lang w:val="en-IN"/>
+        </w:rPr>
+        <w:t>how the things communicate with eachother then?</w:t>
+      </w:r>
+      <w:r>
+        <w:rPr>
+          <w:rFonts w:hint="default" w:ascii="Bodoni MT" w:hAnsi="Bodoni MT" w:cs="Bodoni MT"/>
+          <w:b w:val="0"/>
+          <w:bCs w:val="0"/>
+          <w:i w:val="0"/>
+          <w:iCs w:val="0"/>
+          <w:lang w:val="en-IN"/>
+        </w:rPr>
+        <w:br w:type="textWrapping"/>
+      </w:r>
+      <w:r>
+        <w:rPr>
+          <w:rFonts w:hint="default" w:ascii="Bodoni MT" w:hAnsi="Bodoni MT" w:cs="Bodoni MT"/>
+          <w:b w:val="0"/>
+          <w:bCs w:val="0"/>
+          <w:i w:val="0"/>
+          <w:iCs w:val="0"/>
+          <w:lang w:val="en-IN"/>
+        </w:rPr>
+        <w:t xml:space="preserve">And, </w:t>
+      </w:r>
+      <w:r>
+        <w:rPr>
+          <w:rFonts w:hint="default" w:ascii="Bodoni MT" w:hAnsi="Bodoni MT" w:cs="Bodoni MT"/>
+          <w:b w:val="0"/>
+          <w:bCs w:val="0"/>
+          <w:i w:val="0"/>
+          <w:iCs w:val="0"/>
+          <w:color w:val="C81D31" w:themeColor="accent6" w:themeShade="BF"/>
+          <w:lang w:val="en-IN"/>
+        </w:rPr>
+        <w:t xml:space="preserve">how the resources communicates with each other when they are not running inside any </w:t>
+      </w:r>
+      <w:r>
+        <w:rPr>
+          <w:rFonts w:hint="default" w:ascii="Bodoni MT" w:hAnsi="Bodoni MT" w:cs="Bodoni MT"/>
+          <w:b w:val="0"/>
+          <w:bCs w:val="0"/>
+          <w:i/>
+          <w:iCs/>
+          <w:color w:val="C81D31" w:themeColor="accent6" w:themeShade="BF"/>
+          <w:lang w:val="en-IN"/>
+        </w:rPr>
+        <w:t>pod</w:t>
+      </w:r>
+      <w:r>
+        <w:rPr>
+          <w:rFonts w:hint="default" w:ascii="Bodoni MT" w:hAnsi="Bodoni MT" w:cs="Bodoni MT"/>
+          <w:b w:val="0"/>
+          <w:bCs w:val="0"/>
+          <w:i w:val="0"/>
+          <w:iCs w:val="0"/>
+          <w:color w:val="C81D31" w:themeColor="accent6" w:themeShade="BF"/>
+          <w:lang w:val="en-IN"/>
+        </w:rPr>
+        <w:t xml:space="preserve"> rather running outside normally as a process?</w:t>
       </w:r>
     </w:p>
     <w:p>
@@ -32750,14 +32952,1089 @@
         <w:jc w:val="left"/>
         <w:rPr>
           <w:rFonts w:hint="default" w:ascii="Bodoni MT" w:hAnsi="Bodoni MT" w:cs="Bodoni MT"/>
-        </w:rPr>
-      </w:pPr>
-      <w:r>
-        <w:rPr>
-          <w:rFonts w:hint="default" w:ascii="Bodoni MT" w:hAnsi="Bodoni MT" w:cs="Bodoni MT"/>
-          <w:lang w:val="en-IN"/>
-        </w:rPr>
-        <w:t>F</w:t>
+          <w:b/>
+          <w:bCs/>
+          <w:u w:val="single"/>
+        </w:rPr>
+      </w:pPr>
+      <w:r>
+        <w:rPr>
+          <w:rFonts w:hint="default" w:ascii="Bodoni MT" w:hAnsi="Bodoni MT" w:cs="Bodoni MT"/>
+          <w:b/>
+          <w:bCs/>
+          <w:u w:val="single"/>
+          <w:lang w:val="en-IN"/>
+        </w:rPr>
+        <w:t>First lets see, how they work when run as normal processes.</w:t>
+      </w:r>
+    </w:p>
+    <w:p>
+      <w:pPr>
+        <w:keepNext w:val="0"/>
+        <w:keepLines w:val="0"/>
+        <w:widowControl/>
+        <w:numPr>
+          <w:ilvl w:val="1"/>
+          <w:numId w:val="11"/>
+        </w:numPr>
+        <w:suppressLineNumbers w:val="0"/>
+        <w:spacing w:before="0" w:beforeAutospacing="0" w:after="0" w:afterAutospacing="0" w:line="360" w:lineRule="auto"/>
+        <w:ind w:left="840" w:leftChars="0" w:right="0" w:hanging="420" w:firstLineChars="0"/>
+        <w:jc w:val="left"/>
+        <w:rPr>
+          <w:rFonts w:hint="default" w:ascii="Bodoni MT" w:hAnsi="Bodoni MT" w:cs="Bodoni MT"/>
+        </w:rPr>
+      </w:pPr>
+      <w:r>
+        <w:rPr>
+          <w:rFonts w:hint="default" w:ascii="Bodoni MT" w:hAnsi="Bodoni MT" w:cs="Bodoni MT"/>
+          <w:lang w:val="en-IN"/>
+        </w:rPr>
+        <w:t xml:space="preserve">There are multiple </w:t>
+      </w:r>
+      <w:r>
+        <w:rPr>
+          <w:rFonts w:hint="default" w:ascii="Bodoni MT" w:hAnsi="Bodoni MT" w:cs="Bodoni MT"/>
+          <w:b/>
+          <w:bCs/>
+          <w:i/>
+          <w:iCs/>
+          <w:lang w:val="en-IN"/>
+        </w:rPr>
+        <w:t>configuration</w:t>
+      </w:r>
+      <w:r>
+        <w:rPr>
+          <w:rFonts w:hint="default" w:ascii="Bodoni MT" w:hAnsi="Bodoni MT" w:cs="Bodoni MT"/>
+          <w:b w:val="0"/>
+          <w:bCs w:val="0"/>
+          <w:i w:val="0"/>
+          <w:iCs w:val="0"/>
+          <w:lang w:val="en-IN"/>
+        </w:rPr>
+        <w:t xml:space="preserve"> files inside </w:t>
+      </w:r>
+      <w:r>
+        <w:rPr>
+          <w:rFonts w:hint="default" w:ascii="Bodoni MT" w:hAnsi="Bodoni MT" w:cs="Bodoni MT"/>
+          <w:b/>
+          <w:bCs/>
+          <w:i/>
+          <w:iCs/>
+          <w:lang w:val="en-IN"/>
+        </w:rPr>
+        <w:t>/etc/kubernetes</w:t>
+      </w:r>
+      <w:r>
+        <w:rPr>
+          <w:rFonts w:hint="default" w:ascii="Bodoni MT" w:hAnsi="Bodoni MT" w:cs="Bodoni MT"/>
+          <w:b w:val="0"/>
+          <w:bCs w:val="0"/>
+          <w:i w:val="0"/>
+          <w:iCs w:val="0"/>
+          <w:lang w:val="en-IN"/>
+        </w:rPr>
+        <w:t xml:space="preserve"> directory.</w:t>
+      </w:r>
+      <w:r>
+        <w:rPr>
+          <w:rFonts w:hint="default" w:ascii="Bodoni MT" w:hAnsi="Bodoni MT" w:cs="Bodoni MT"/>
+          <w:b w:val="0"/>
+          <w:bCs w:val="0"/>
+          <w:i w:val="0"/>
+          <w:iCs w:val="0"/>
+          <w:lang w:val="en-IN"/>
+        </w:rPr>
+        <w:br w:type="textWrapping"/>
+      </w:r>
+      <w:r>
+        <w:rPr>
+          <w:rFonts w:hint="default" w:ascii="Bodoni MT" w:hAnsi="Bodoni MT" w:cs="Bodoni MT"/>
+        </w:rPr>
+        <w:drawing>
+          <wp:inline distT="0" distB="0" distL="114300" distR="114300">
+            <wp:extent cx="5802630" cy="295910"/>
+            <wp:effectExtent l="0" t="0" r="1270" b="8890"/>
+            <wp:docPr id="25" name="Picture 3"/>
+            <wp:cNvGraphicFramePr>
+              <a:graphicFrameLocks xmlns:a="http://schemas.openxmlformats.org/drawingml/2006/main" noChangeAspect="1"/>
+            </wp:cNvGraphicFramePr>
+            <a:graphic xmlns:a="http://schemas.openxmlformats.org/drawingml/2006/main">
+              <a:graphicData uri="http://schemas.openxmlformats.org/drawingml/2006/picture">
+                <pic:pic xmlns:pic="http://schemas.openxmlformats.org/drawingml/2006/picture">
+                  <pic:nvPicPr>
+                    <pic:cNvPr id="25" name="Picture 3"/>
+                    <pic:cNvPicPr>
+                      <a:picLocks noChangeAspect="1"/>
+                    </pic:cNvPicPr>
+                  </pic:nvPicPr>
+                  <pic:blipFill>
+                    <a:blip r:embed="rId104"/>
+                    <a:stretch>
+                      <a:fillRect/>
+                    </a:stretch>
+                  </pic:blipFill>
+                  <pic:spPr>
+                    <a:xfrm>
+                      <a:off x="0" y="0"/>
+                      <a:ext cx="5802630" cy="295910"/>
+                    </a:xfrm>
+                    <a:prstGeom prst="rect">
+                      <a:avLst/>
+                    </a:prstGeom>
+                    <a:noFill/>
+                    <a:ln>
+                      <a:noFill/>
+                    </a:ln>
+                  </pic:spPr>
+                </pic:pic>
+              </a:graphicData>
+            </a:graphic>
+          </wp:inline>
+        </w:drawing>
+      </w:r>
+    </w:p>
+    <w:p>
+      <w:pPr>
+        <w:keepNext w:val="0"/>
+        <w:keepLines w:val="0"/>
+        <w:widowControl/>
+        <w:numPr>
+          <w:ilvl w:val="1"/>
+          <w:numId w:val="11"/>
+        </w:numPr>
+        <w:suppressLineNumbers w:val="0"/>
+        <w:spacing w:before="0" w:beforeAutospacing="0" w:after="0" w:afterAutospacing="0" w:line="360" w:lineRule="auto"/>
+        <w:ind w:left="840" w:leftChars="0" w:right="0" w:hanging="420" w:firstLineChars="0"/>
+        <w:jc w:val="left"/>
+        <w:rPr>
+          <w:rFonts w:hint="default" w:ascii="Bodoni MT" w:hAnsi="Bodoni MT" w:cs="Bodoni MT"/>
+        </w:rPr>
+      </w:pPr>
+      <w:r>
+        <w:rPr>
+          <w:rFonts w:hint="default" w:ascii="Bodoni MT" w:hAnsi="Bodoni MT" w:cs="Bodoni MT"/>
+          <w:lang w:val="en-IN"/>
+        </w:rPr>
+        <w:t xml:space="preserve">All these files contains the specific requirements of each processes like </w:t>
+      </w:r>
+      <w:r>
+        <w:rPr>
+          <w:rFonts w:hint="default" w:ascii="Bodoni MT" w:hAnsi="Bodoni MT" w:cs="Bodoni MT"/>
+          <w:i/>
+          <w:iCs/>
+          <w:lang w:val="en-IN"/>
+        </w:rPr>
+        <w:t xml:space="preserve">scheduler, controller manager </w:t>
+      </w:r>
+      <w:r>
+        <w:rPr>
+          <w:rFonts w:hint="default" w:ascii="Bodoni MT" w:hAnsi="Bodoni MT" w:cs="Bodoni MT"/>
+          <w:i w:val="0"/>
+          <w:iCs w:val="0"/>
+          <w:lang w:val="en-IN"/>
+        </w:rPr>
+        <w:t>…etc.</w:t>
+      </w:r>
+    </w:p>
+    <w:p>
+      <w:pPr>
+        <w:keepNext w:val="0"/>
+        <w:keepLines w:val="0"/>
+        <w:widowControl/>
+        <w:numPr>
+          <w:ilvl w:val="1"/>
+          <w:numId w:val="15"/>
+        </w:numPr>
+        <w:suppressLineNumbers w:val="0"/>
+        <w:spacing w:before="0" w:beforeAutospacing="0" w:after="0" w:afterAutospacing="0" w:line="360" w:lineRule="auto"/>
+        <w:ind w:left="840" w:leftChars="0" w:right="0" w:hanging="420" w:firstLineChars="0"/>
+        <w:jc w:val="left"/>
+        <w:rPr>
+          <w:rFonts w:hint="default" w:ascii="Bodoni MT" w:hAnsi="Bodoni MT" w:eastAsia="SimSun" w:cs="Bodoni MT"/>
+          <w:sz w:val="22"/>
+          <w:szCs w:val="22"/>
+        </w:rPr>
+      </w:pPr>
+      <w:r>
+        <w:rPr>
+          <w:rFonts w:hint="default" w:ascii="Bodoni MT" w:hAnsi="Bodoni MT" w:eastAsia="SimSun" w:cs="Bodoni MT"/>
+          <w:color w:val="auto"/>
+          <w:kern w:val="0"/>
+          <w:sz w:val="22"/>
+          <w:szCs w:val="22"/>
+          <w:lang w:val="en-US" w:eastAsia="zh-CN" w:bidi="ar"/>
+        </w:rPr>
+        <w:t xml:space="preserve">All the </w:t>
+      </w:r>
+      <w:r>
+        <w:rPr>
+          <w:rFonts w:hint="default" w:ascii="Bodoni MT" w:hAnsi="Bodoni MT" w:eastAsia="SimSun" w:cs="Bodoni MT"/>
+          <w:b/>
+          <w:bCs/>
+          <w:i/>
+          <w:iCs/>
+          <w:color w:val="auto"/>
+          <w:kern w:val="0"/>
+          <w:sz w:val="22"/>
+          <w:szCs w:val="22"/>
+          <w:lang w:val="en-US" w:eastAsia="zh-CN" w:bidi="ar"/>
+        </w:rPr>
+        <w:t>.conf</w:t>
+      </w:r>
+      <w:r>
+        <w:rPr>
+          <w:rFonts w:hint="default" w:ascii="Bodoni MT" w:hAnsi="Bodoni MT" w:eastAsia="SimSun" w:cs="Bodoni MT"/>
+          <w:b w:val="0"/>
+          <w:bCs w:val="0"/>
+          <w:i w:val="0"/>
+          <w:iCs w:val="0"/>
+          <w:color w:val="auto"/>
+          <w:kern w:val="0"/>
+          <w:sz w:val="22"/>
+          <w:szCs w:val="22"/>
+          <w:lang w:val="en-US" w:eastAsia="zh-CN" w:bidi="ar"/>
+        </w:rPr>
+        <w:t xml:space="preserve"> files are having same structure as the </w:t>
+      </w:r>
+      <w:r>
+        <w:rPr>
+          <w:rFonts w:hint="default" w:ascii="Bodoni MT" w:hAnsi="Bodoni MT" w:eastAsia="SimSun" w:cs="Bodoni MT"/>
+          <w:b/>
+          <w:bCs/>
+          <w:i/>
+          <w:iCs/>
+          <w:color w:val="auto"/>
+          <w:kern w:val="0"/>
+          <w:sz w:val="22"/>
+          <w:szCs w:val="22"/>
+          <w:lang w:val="en-US" w:eastAsia="zh-CN" w:bidi="ar"/>
+        </w:rPr>
+        <w:t>~/.kube/config</w:t>
+      </w:r>
+      <w:r>
+        <w:rPr>
+          <w:rFonts w:hint="default" w:ascii="Bodoni MT" w:hAnsi="Bodoni MT" w:eastAsia="SimSun" w:cs="Bodoni MT"/>
+          <w:b w:val="0"/>
+          <w:bCs w:val="0"/>
+          <w:i w:val="0"/>
+          <w:iCs w:val="0"/>
+          <w:color w:val="auto"/>
+          <w:kern w:val="0"/>
+          <w:sz w:val="22"/>
+          <w:szCs w:val="22"/>
+          <w:lang w:val="en-US" w:eastAsia="zh-CN" w:bidi="ar"/>
+        </w:rPr>
+        <w:t xml:space="preserve"> file, but </w:t>
+      </w:r>
+      <w:r>
+        <w:rPr>
+          <w:rFonts w:hint="default" w:ascii="Bodoni MT" w:hAnsi="Bodoni MT" w:eastAsia="SimSun" w:cs="Bodoni MT"/>
+          <w:b w:val="0"/>
+          <w:bCs w:val="0"/>
+          <w:i w:val="0"/>
+          <w:iCs w:val="0"/>
+          <w:color w:val="auto"/>
+          <w:kern w:val="0"/>
+          <w:sz w:val="22"/>
+          <w:szCs w:val="22"/>
+          <w:lang w:val="en-US" w:eastAsia="zh-CN" w:bidi="ar"/>
+        </w:rPr>
+        <w:br w:type="textWrapping"/>
+      </w:r>
+      <w:r>
+        <w:rPr>
+          <w:rFonts w:hint="default" w:ascii="Bodoni MT" w:hAnsi="Bodoni MT" w:eastAsia="SimSun" w:cs="Bodoni MT"/>
+          <w:b/>
+          <w:bCs/>
+          <w:i w:val="0"/>
+          <w:iCs w:val="0"/>
+          <w:color w:val="auto"/>
+          <w:kern w:val="0"/>
+          <w:sz w:val="22"/>
+          <w:szCs w:val="22"/>
+          <w:lang w:val="en-US" w:eastAsia="zh-CN" w:bidi="ar"/>
+        </w:rPr>
+        <w:t>user, certificates, permissions</w:t>
+      </w:r>
+      <w:r>
+        <w:rPr>
+          <w:rFonts w:hint="default" w:ascii="Bodoni MT" w:hAnsi="Bodoni MT" w:eastAsia="SimSun" w:cs="Bodoni MT"/>
+          <w:b w:val="0"/>
+          <w:bCs w:val="0"/>
+          <w:i w:val="0"/>
+          <w:iCs w:val="0"/>
+          <w:color w:val="auto"/>
+          <w:kern w:val="0"/>
+          <w:sz w:val="22"/>
+          <w:szCs w:val="22"/>
+          <w:lang w:val="en-US" w:eastAsia="zh-CN" w:bidi="ar"/>
+        </w:rPr>
+        <w:t xml:space="preserve"> are different.</w:t>
+      </w:r>
+    </w:p>
+    <w:p>
+      <w:pPr>
+        <w:keepNext w:val="0"/>
+        <w:keepLines w:val="0"/>
+        <w:widowControl/>
+        <w:numPr>
+          <w:ilvl w:val="1"/>
+          <w:numId w:val="15"/>
+        </w:numPr>
+        <w:suppressLineNumbers w:val="0"/>
+        <w:spacing w:before="0" w:beforeAutospacing="0" w:after="0" w:afterAutospacing="0" w:line="360" w:lineRule="auto"/>
+        <w:ind w:left="840" w:leftChars="0" w:right="0" w:hanging="420" w:firstLineChars="0"/>
+        <w:jc w:val="left"/>
+        <w:rPr>
+          <w:rFonts w:hint="default" w:ascii="Bodoni MT" w:hAnsi="Bodoni MT" w:cs="Bodoni MT"/>
+        </w:rPr>
+      </w:pPr>
+      <w:r>
+        <w:rPr>
+          <w:rFonts w:hint="default" w:ascii="Bodoni MT" w:hAnsi="Bodoni MT" w:eastAsia="SimSun" w:cs="Bodoni MT"/>
+          <w:b w:val="0"/>
+          <w:bCs w:val="0"/>
+          <w:i w:val="0"/>
+          <w:iCs w:val="0"/>
+          <w:color w:val="auto"/>
+          <w:kern w:val="0"/>
+          <w:sz w:val="22"/>
+          <w:szCs w:val="22"/>
+          <w:lang w:val="en-US" w:eastAsia="zh-CN" w:bidi="ar"/>
+        </w:rPr>
+        <w:t xml:space="preserve">In the </w:t>
+      </w:r>
+      <w:r>
+        <w:rPr>
+          <w:rFonts w:hint="default" w:ascii="Bodoni MT" w:hAnsi="Bodoni MT" w:eastAsia="SimSun" w:cs="Bodoni MT"/>
+          <w:b/>
+          <w:bCs/>
+          <w:i/>
+          <w:iCs/>
+          <w:color w:val="auto"/>
+          <w:kern w:val="0"/>
+          <w:sz w:val="22"/>
+          <w:szCs w:val="22"/>
+          <w:lang w:val="en-US" w:eastAsia="zh-CN" w:bidi="ar"/>
+        </w:rPr>
+        <w:t>scheduler.conf</w:t>
+      </w:r>
+      <w:r>
+        <w:rPr>
+          <w:rFonts w:hint="default" w:ascii="Bodoni MT" w:hAnsi="Bodoni MT" w:eastAsia="SimSun" w:cs="Bodoni MT"/>
+          <w:b w:val="0"/>
+          <w:bCs w:val="0"/>
+          <w:i w:val="0"/>
+          <w:iCs w:val="0"/>
+          <w:color w:val="auto"/>
+          <w:kern w:val="0"/>
+          <w:sz w:val="22"/>
+          <w:szCs w:val="22"/>
+          <w:lang w:val="en-US" w:eastAsia="zh-CN" w:bidi="ar"/>
+        </w:rPr>
+        <w:t xml:space="preserve"> the user is </w:t>
+      </w:r>
+      <w:r>
+        <w:rPr>
+          <w:rFonts w:hint="default" w:ascii="Bodoni MT" w:hAnsi="Bodoni MT" w:eastAsia="SimSun" w:cs="Bodoni MT"/>
+          <w:b w:val="0"/>
+          <w:bCs w:val="0"/>
+          <w:i w:val="0"/>
+          <w:iCs w:val="0"/>
+          <w:color w:val="C71C31"/>
+          <w:kern w:val="0"/>
+          <w:sz w:val="22"/>
+          <w:szCs w:val="22"/>
+          <w:lang w:val="en-US" w:eastAsia="zh-CN" w:bidi="ar"/>
+        </w:rPr>
+        <w:t>system:kube-scheduler</w:t>
+      </w:r>
+      <w:r>
+        <w:rPr>
+          <w:rFonts w:hint="default" w:ascii="Bodoni MT" w:hAnsi="Bodoni MT" w:eastAsia="SimSun" w:cs="Bodoni MT"/>
+          <w:b w:val="0"/>
+          <w:bCs w:val="0"/>
+          <w:i w:val="0"/>
+          <w:iCs w:val="0"/>
+          <w:color w:val="auto"/>
+          <w:kern w:val="0"/>
+          <w:sz w:val="22"/>
+          <w:szCs w:val="22"/>
+          <w:lang w:val="en-US" w:eastAsia="zh-CN" w:bidi="ar"/>
+        </w:rPr>
+        <w:br w:type="textWrapping"/>
+      </w:r>
+      <w:r>
+        <w:rPr>
+          <w:rFonts w:hint="default" w:ascii="Bodoni MT" w:hAnsi="Bodoni MT" w:eastAsia="SimSun" w:cs="Bodoni MT"/>
+          <w:color w:val="auto"/>
+          <w:kern w:val="0"/>
+          <w:sz w:val="22"/>
+          <w:szCs w:val="22"/>
+          <w:lang w:val="en-US" w:eastAsia="zh-CN" w:bidi="ar"/>
+        </w:rPr>
+        <w:drawing>
+          <wp:inline distT="0" distB="0" distL="114300" distR="114300">
+            <wp:extent cx="2162175" cy="609600"/>
+            <wp:effectExtent l="0" t="0" r="9525" b="0"/>
+            <wp:docPr id="37" name="Picture 9" descr="IMG_256"/>
+            <wp:cNvGraphicFramePr>
+              <a:graphicFrameLocks xmlns:a="http://schemas.openxmlformats.org/drawingml/2006/main" noChangeAspect="1"/>
+            </wp:cNvGraphicFramePr>
+            <a:graphic xmlns:a="http://schemas.openxmlformats.org/drawingml/2006/main">
+              <a:graphicData uri="http://schemas.openxmlformats.org/drawingml/2006/picture">
+                <pic:pic xmlns:pic="http://schemas.openxmlformats.org/drawingml/2006/picture">
+                  <pic:nvPicPr>
+                    <pic:cNvPr id="37" name="Picture 9" descr="IMG_256"/>
+                    <pic:cNvPicPr>
+                      <a:picLocks noChangeAspect="1"/>
+                    </pic:cNvPicPr>
+                  </pic:nvPicPr>
+                  <pic:blipFill>
+                    <a:blip r:embed="rId105"/>
+                    <a:stretch>
+                      <a:fillRect/>
+                    </a:stretch>
+                  </pic:blipFill>
+                  <pic:spPr>
+                    <a:xfrm>
+                      <a:off x="0" y="0"/>
+                      <a:ext cx="2162175" cy="609600"/>
+                    </a:xfrm>
+                    <a:prstGeom prst="rect">
+                      <a:avLst/>
+                    </a:prstGeom>
+                    <a:noFill/>
+                    <a:ln w="9525">
+                      <a:noFill/>
+                    </a:ln>
+                  </pic:spPr>
+                </pic:pic>
+              </a:graphicData>
+            </a:graphic>
+          </wp:inline>
+        </w:drawing>
+      </w:r>
+    </w:p>
+    <w:p>
+      <w:pPr>
+        <w:keepNext w:val="0"/>
+        <w:keepLines w:val="0"/>
+        <w:widowControl/>
+        <w:numPr>
+          <w:ilvl w:val="1"/>
+          <w:numId w:val="11"/>
+        </w:numPr>
+        <w:suppressLineNumbers w:val="0"/>
+        <w:spacing w:before="0" w:beforeAutospacing="0" w:after="0" w:afterAutospacing="0" w:line="360" w:lineRule="auto"/>
+        <w:ind w:left="840" w:leftChars="0" w:right="0" w:hanging="420" w:firstLineChars="0"/>
+        <w:jc w:val="left"/>
+        <w:rPr>
+          <w:rFonts w:hint="default" w:ascii="Bodoni MT" w:hAnsi="Bodoni MT" w:cs="Bodoni MT"/>
+        </w:rPr>
+      </w:pPr>
+      <w:r>
+        <w:rPr>
+          <w:rFonts w:hint="default" w:ascii="Bodoni MT" w:hAnsi="Bodoni MT" w:cs="Bodoni MT"/>
+          <w:i/>
+          <w:iCs/>
+          <w:lang w:val="en-IN"/>
+        </w:rPr>
+        <w:t>kube</w:t>
+      </w:r>
+      <w:r>
+        <w:rPr>
+          <w:rFonts w:hint="default" w:ascii="Bodoni MT" w:hAnsi="Bodoni MT" w:cs="Bodoni MT"/>
+          <w:b/>
+          <w:bCs/>
+          <w:i/>
+          <w:iCs/>
+          <w:color w:val="7030A0"/>
+          <w:lang w:val="en-IN"/>
+        </w:rPr>
+        <w:t>let</w:t>
+      </w:r>
+      <w:r>
+        <w:rPr>
+          <w:rFonts w:hint="default" w:ascii="Bodoni MT" w:hAnsi="Bodoni MT" w:cs="Bodoni MT"/>
+          <w:i/>
+          <w:iCs/>
+          <w:lang w:val="en-IN"/>
+        </w:rPr>
+        <w:t>, kube</w:t>
+      </w:r>
+      <w:r>
+        <w:rPr>
+          <w:rFonts w:hint="default" w:ascii="Bodoni MT" w:hAnsi="Bodoni MT" w:cs="Bodoni MT"/>
+          <w:b/>
+          <w:bCs/>
+          <w:i/>
+          <w:iCs/>
+          <w:color w:val="7030A0"/>
+          <w:lang w:val="en-IN"/>
+        </w:rPr>
+        <w:t>ctl</w:t>
+      </w:r>
+      <w:r>
+        <w:rPr>
+          <w:rFonts w:hint="default" w:ascii="Bodoni MT" w:hAnsi="Bodoni MT" w:cs="Bodoni MT"/>
+          <w:b w:val="0"/>
+          <w:bCs w:val="0"/>
+          <w:i/>
+          <w:iCs/>
+          <w:lang w:val="en-IN"/>
+        </w:rPr>
+        <w:t>, controller, scheduler</w:t>
+      </w:r>
+      <w:r>
+        <w:rPr>
+          <w:rFonts w:hint="default" w:ascii="Bodoni MT" w:hAnsi="Bodoni MT" w:cs="Bodoni MT"/>
+          <w:b w:val="0"/>
+          <w:bCs w:val="0"/>
+          <w:i w:val="0"/>
+          <w:iCs w:val="0"/>
+          <w:lang w:val="en-IN"/>
+        </w:rPr>
+        <w:t xml:space="preserve"> all talks to API Server.</w:t>
+      </w:r>
+      <w:r>
+        <w:rPr>
+          <w:rFonts w:hint="default" w:ascii="Bodoni MT" w:hAnsi="Bodoni MT" w:cs="Bodoni MT"/>
+          <w:b w:val="0"/>
+          <w:bCs w:val="0"/>
+          <w:i w:val="0"/>
+          <w:iCs w:val="0"/>
+          <w:lang w:val="en-IN"/>
+        </w:rPr>
+        <w:br w:type="textWrapping"/>
+      </w:r>
+      <w:r>
+        <w:rPr>
+          <w:rFonts w:hint="default" w:ascii="Bodoni MT" w:hAnsi="Bodoni MT" w:cs="Bodoni MT"/>
+          <w:b w:val="0"/>
+          <w:bCs w:val="0"/>
+          <w:i w:val="0"/>
+          <w:iCs w:val="0"/>
+          <w:lang w:val="en-IN"/>
+        </w:rPr>
+        <w:t xml:space="preserve">API Server only directly talks to </w:t>
+      </w:r>
+      <w:r>
+        <w:rPr>
+          <w:rFonts w:hint="default" w:ascii="Bodoni MT" w:hAnsi="Bodoni MT" w:cs="Bodoni MT"/>
+          <w:b/>
+          <w:bCs/>
+          <w:i/>
+          <w:iCs/>
+          <w:lang w:val="en-IN"/>
+        </w:rPr>
+        <w:t>etcd</w:t>
+      </w:r>
+      <w:r>
+        <w:rPr>
+          <w:rFonts w:hint="default" w:ascii="Bodoni MT" w:hAnsi="Bodoni MT" w:cs="Bodoni MT"/>
+          <w:b w:val="0"/>
+          <w:bCs w:val="0"/>
+          <w:i w:val="0"/>
+          <w:iCs w:val="0"/>
+          <w:lang w:val="en-IN"/>
+        </w:rPr>
+        <w:t>.</w:t>
+      </w:r>
+      <w:r>
+        <w:rPr>
+          <w:rFonts w:hint="default" w:ascii="Bodoni MT" w:hAnsi="Bodoni MT" w:cs="Bodoni MT"/>
+          <w:b w:val="0"/>
+          <w:bCs w:val="0"/>
+          <w:i w:val="0"/>
+          <w:iCs w:val="0"/>
+          <w:lang w:val="en-IN"/>
+        </w:rPr>
+        <w:br w:type="textWrapping"/>
+      </w:r>
+      <w:r>
+        <w:rPr>
+          <w:rFonts w:hint="default" w:ascii="Bodoni MT" w:hAnsi="Bodoni MT" w:cs="Bodoni MT"/>
+        </w:rPr>
+        <w:drawing>
+          <wp:inline distT="0" distB="0" distL="114300" distR="114300">
+            <wp:extent cx="2676525" cy="836295"/>
+            <wp:effectExtent l="0" t="0" r="3175" b="1905"/>
+            <wp:docPr id="31" name="Picture 4"/>
+            <wp:cNvGraphicFramePr>
+              <a:graphicFrameLocks xmlns:a="http://schemas.openxmlformats.org/drawingml/2006/main" noChangeAspect="1"/>
+            </wp:cNvGraphicFramePr>
+            <a:graphic xmlns:a="http://schemas.openxmlformats.org/drawingml/2006/main">
+              <a:graphicData uri="http://schemas.openxmlformats.org/drawingml/2006/picture">
+                <pic:pic xmlns:pic="http://schemas.openxmlformats.org/drawingml/2006/picture">
+                  <pic:nvPicPr>
+                    <pic:cNvPr id="31" name="Picture 4"/>
+                    <pic:cNvPicPr>
+                      <a:picLocks noChangeAspect="1"/>
+                    </pic:cNvPicPr>
+                  </pic:nvPicPr>
+                  <pic:blipFill>
+                    <a:blip r:embed="rId106"/>
+                    <a:stretch>
+                      <a:fillRect/>
+                    </a:stretch>
+                  </pic:blipFill>
+                  <pic:spPr>
+                    <a:xfrm>
+                      <a:off x="0" y="0"/>
+                      <a:ext cx="2676525" cy="836295"/>
+                    </a:xfrm>
+                    <a:prstGeom prst="rect">
+                      <a:avLst/>
+                    </a:prstGeom>
+                    <a:noFill/>
+                    <a:ln>
+                      <a:noFill/>
+                    </a:ln>
+                  </pic:spPr>
+                </pic:pic>
+              </a:graphicData>
+            </a:graphic>
+          </wp:inline>
+        </w:drawing>
+      </w:r>
+      <w:r>
+        <w:rPr>
+          <w:rFonts w:hint="default" w:ascii="Bodoni MT" w:hAnsi="Bodoni MT" w:cs="Bodoni MT"/>
+        </w:rPr>
+        <w:br w:type="textWrapping"/>
+      </w:r>
+      <w:r>
+        <w:rPr>
+          <w:rFonts w:hint="default" w:ascii="Bodoni MT" w:hAnsi="Bodoni MT" w:cs="Bodoni MT"/>
+          <w:color w:val="C65F10" w:themeColor="accent2" w:themeShade="BF"/>
+          <w:shd w:val="clear" w:color="FFFFFF" w:fill="D9D9D9"/>
+          <w:lang w:val="en-IN"/>
+        </w:rPr>
+        <w:t xml:space="preserve">[ No component talks to </w:t>
+      </w:r>
+      <w:r>
+        <w:rPr>
+          <w:rFonts w:hint="default" w:ascii="Bodoni MT" w:hAnsi="Bodoni MT" w:cs="Bodoni MT"/>
+          <w:b/>
+          <w:bCs/>
+          <w:i/>
+          <w:iCs/>
+          <w:color w:val="C65F10" w:themeColor="accent2" w:themeShade="BF"/>
+          <w:shd w:val="clear" w:color="FFFFFF" w:fill="D9D9D9"/>
+          <w:lang w:val="en-IN"/>
+        </w:rPr>
+        <w:t>etcd</w:t>
+      </w:r>
+      <w:r>
+        <w:rPr>
+          <w:rFonts w:hint="default" w:ascii="Bodoni MT" w:hAnsi="Bodoni MT" w:cs="Bodoni MT"/>
+          <w:b w:val="0"/>
+          <w:bCs w:val="0"/>
+          <w:i w:val="0"/>
+          <w:iCs w:val="0"/>
+          <w:color w:val="C65F10" w:themeColor="accent2" w:themeShade="BF"/>
+          <w:shd w:val="clear" w:color="FFFFFF" w:fill="D9D9D9"/>
+          <w:lang w:val="en-IN"/>
+        </w:rPr>
+        <w:t xml:space="preserve"> directly except </w:t>
+      </w:r>
+      <w:r>
+        <w:rPr>
+          <w:rFonts w:hint="default" w:ascii="Bodoni MT" w:hAnsi="Bodoni MT" w:cs="Bodoni MT"/>
+          <w:b w:val="0"/>
+          <w:bCs w:val="0"/>
+          <w:i/>
+          <w:iCs/>
+          <w:color w:val="C65F10" w:themeColor="accent2" w:themeShade="BF"/>
+          <w:shd w:val="clear" w:color="FFFFFF" w:fill="D9D9D9"/>
+          <w:lang w:val="en-IN"/>
+        </w:rPr>
+        <w:t xml:space="preserve">API Server </w:t>
+      </w:r>
+      <w:r>
+        <w:rPr>
+          <w:rFonts w:hint="default" w:ascii="Bodoni MT" w:hAnsi="Bodoni MT" w:cs="Bodoni MT"/>
+          <w:b w:val="0"/>
+          <w:bCs w:val="0"/>
+          <w:i w:val="0"/>
+          <w:iCs w:val="0"/>
+          <w:color w:val="C65F10" w:themeColor="accent2" w:themeShade="BF"/>
+          <w:shd w:val="clear" w:color="FFFFFF" w:fill="D9D9D9"/>
+          <w:lang w:val="en-IN"/>
+        </w:rPr>
+        <w:t>]</w:t>
+      </w:r>
+    </w:p>
+    <w:p>
+      <w:pPr>
+        <w:keepNext w:val="0"/>
+        <w:keepLines w:val="0"/>
+        <w:widowControl/>
+        <w:numPr>
+          <w:ilvl w:val="1"/>
+          <w:numId w:val="11"/>
+        </w:numPr>
+        <w:suppressLineNumbers w:val="0"/>
+        <w:spacing w:before="0" w:beforeAutospacing="0" w:after="0" w:afterAutospacing="0" w:line="360" w:lineRule="auto"/>
+        <w:ind w:left="840" w:leftChars="0" w:right="0" w:hanging="420" w:firstLineChars="0"/>
+        <w:jc w:val="left"/>
+        <w:rPr>
+          <w:rFonts w:hint="default" w:ascii="Bodoni MT" w:hAnsi="Bodoni MT" w:cs="Bodoni MT"/>
+        </w:rPr>
+      </w:pPr>
+      <w:r>
+        <w:rPr>
+          <w:rFonts w:hint="default" w:ascii="Bodoni MT" w:hAnsi="Bodoni MT" w:cs="Bodoni MT"/>
+          <w:lang w:val="en-IN"/>
+        </w:rPr>
+        <w:t xml:space="preserve">For example, if you see the </w:t>
+      </w:r>
+      <w:r>
+        <w:rPr>
+          <w:rFonts w:hint="default" w:ascii="Bodoni MT" w:hAnsi="Bodoni MT" w:cs="Bodoni MT"/>
+          <w:i/>
+          <w:iCs/>
+          <w:lang w:val="en-IN"/>
+        </w:rPr>
+        <w:t>config</w:t>
+      </w:r>
+      <w:r>
+        <w:rPr>
+          <w:rFonts w:hint="default" w:ascii="Bodoni MT" w:hAnsi="Bodoni MT" w:cs="Bodoni MT"/>
+          <w:i w:val="0"/>
+          <w:iCs w:val="0"/>
+          <w:lang w:val="en-IN"/>
+        </w:rPr>
+        <w:t xml:space="preserve"> files, the </w:t>
+      </w:r>
+      <w:r>
+        <w:rPr>
+          <w:rFonts w:hint="default" w:ascii="Bodoni MT" w:hAnsi="Bodoni MT" w:cs="Bodoni MT"/>
+          <w:b/>
+          <w:bCs/>
+          <w:i/>
+          <w:iCs/>
+          <w:lang w:val="en-IN"/>
+        </w:rPr>
+        <w:t>server</w:t>
+      </w:r>
+      <w:r>
+        <w:rPr>
+          <w:rFonts w:hint="default" w:ascii="Bodoni MT" w:hAnsi="Bodoni MT" w:cs="Bodoni MT"/>
+          <w:b w:val="0"/>
+          <w:bCs w:val="0"/>
+          <w:i w:val="0"/>
+          <w:iCs w:val="0"/>
+          <w:lang w:val="en-IN"/>
+        </w:rPr>
+        <w:t xml:space="preserve"> will be having</w:t>
+      </w:r>
+      <w:r>
+        <w:rPr>
+          <w:rFonts w:hint="default" w:ascii="Bodoni MT" w:hAnsi="Bodoni MT" w:cs="Bodoni MT"/>
+          <w:b w:val="0"/>
+          <w:bCs w:val="0"/>
+          <w:i w:val="0"/>
+          <w:iCs w:val="0"/>
+          <w:lang w:val="en-IN"/>
+        </w:rPr>
+        <w:br w:type="textWrapping"/>
+      </w:r>
+      <w:r>
+        <w:rPr>
+          <w:rFonts w:hint="default" w:ascii="Bodoni MT" w:hAnsi="Bodoni MT" w:cs="Bodoni MT"/>
+          <w:b/>
+          <w:bCs/>
+          <w:i w:val="0"/>
+          <w:iCs w:val="0"/>
+          <w:color w:val="7030A0"/>
+          <w:lang w:val="en-IN"/>
+        </w:rPr>
+        <w:t>&lt;</w:t>
+      </w:r>
+      <w:r>
+        <w:rPr>
+          <w:rFonts w:hint="default" w:ascii="Bodoni MT" w:hAnsi="Bodoni MT" w:cs="Bodoni MT"/>
+          <w:b w:val="0"/>
+          <w:bCs w:val="0"/>
+          <w:i w:val="0"/>
+          <w:iCs w:val="0"/>
+          <w:color w:val="7030A0"/>
+          <w:lang w:val="en-IN"/>
+        </w:rPr>
+        <w:t>control plane node’s IP</w:t>
+      </w:r>
+      <w:r>
+        <w:rPr>
+          <w:rFonts w:hint="default" w:ascii="Bodoni MT" w:hAnsi="Bodoni MT" w:cs="Bodoni MT"/>
+          <w:b/>
+          <w:bCs/>
+          <w:i w:val="0"/>
+          <w:iCs w:val="0"/>
+          <w:color w:val="7030A0"/>
+          <w:lang w:val="en-IN"/>
+        </w:rPr>
+        <w:t>&gt;:6443</w:t>
+      </w:r>
+      <w:r>
+        <w:rPr>
+          <w:rFonts w:hint="default" w:ascii="Bodoni MT" w:hAnsi="Bodoni MT" w:cs="Bodoni MT"/>
+          <w:b w:val="0"/>
+          <w:bCs w:val="0"/>
+          <w:i w:val="0"/>
+          <w:iCs w:val="0"/>
+          <w:lang w:val="en-IN"/>
+        </w:rPr>
+        <w:br w:type="textWrapping"/>
+      </w:r>
+      <w:r>
+        <w:rPr>
+          <w:rFonts w:hint="default" w:ascii="Bodoni MT" w:hAnsi="Bodoni MT" w:cs="Bodoni MT"/>
+          <w:b w:val="0"/>
+          <w:bCs w:val="0"/>
+          <w:i w:val="0"/>
+          <w:iCs w:val="0"/>
+          <w:lang w:val="en-IN"/>
+        </w:rPr>
+        <w:t xml:space="preserve">because, API Server listens on port </w:t>
+      </w:r>
+      <w:r>
+        <w:rPr>
+          <w:rFonts w:hint="default" w:ascii="Bodoni MT" w:hAnsi="Bodoni MT" w:cs="Bodoni MT"/>
+          <w:b w:val="0"/>
+          <w:bCs w:val="0"/>
+          <w:i/>
+          <w:iCs/>
+          <w:lang w:val="en-IN"/>
+        </w:rPr>
+        <w:t>6443</w:t>
+      </w:r>
+      <w:r>
+        <w:rPr>
+          <w:rFonts w:hint="default" w:ascii="Bodoni MT" w:hAnsi="Bodoni MT" w:cs="Bodoni MT"/>
+          <w:b w:val="0"/>
+          <w:bCs w:val="0"/>
+          <w:i w:val="0"/>
+          <w:iCs w:val="0"/>
+          <w:lang w:val="en-IN"/>
+        </w:rPr>
+        <w:t>.</w:t>
+      </w:r>
+      <w:r>
+        <w:rPr>
+          <w:rFonts w:hint="default" w:ascii="Bodoni MT" w:hAnsi="Bodoni MT" w:cs="Bodoni MT"/>
+          <w:b w:val="0"/>
+          <w:bCs w:val="0"/>
+          <w:i w:val="0"/>
+          <w:iCs w:val="0"/>
+          <w:lang w:val="en-IN"/>
+        </w:rPr>
+        <w:br w:type="textWrapping"/>
+      </w:r>
+      <w:r>
+        <w:rPr>
+          <w:rFonts w:hint="default" w:ascii="Bodoni MT" w:hAnsi="Bodoni MT" w:cs="Bodoni MT"/>
+        </w:rPr>
+        <w:drawing>
+          <wp:inline distT="0" distB="0" distL="114300" distR="114300">
+            <wp:extent cx="5271770" cy="1023620"/>
+            <wp:effectExtent l="0" t="0" r="11430" b="5080"/>
+            <wp:docPr id="33" name="Picture 5"/>
+            <wp:cNvGraphicFramePr>
+              <a:graphicFrameLocks xmlns:a="http://schemas.openxmlformats.org/drawingml/2006/main" noChangeAspect="1"/>
+            </wp:cNvGraphicFramePr>
+            <a:graphic xmlns:a="http://schemas.openxmlformats.org/drawingml/2006/main">
+              <a:graphicData uri="http://schemas.openxmlformats.org/drawingml/2006/picture">
+                <pic:pic xmlns:pic="http://schemas.openxmlformats.org/drawingml/2006/picture">
+                  <pic:nvPicPr>
+                    <pic:cNvPr id="33" name="Picture 5"/>
+                    <pic:cNvPicPr>
+                      <a:picLocks noChangeAspect="1"/>
+                    </pic:cNvPicPr>
+                  </pic:nvPicPr>
+                  <pic:blipFill>
+                    <a:blip r:embed="rId107"/>
+                    <a:stretch>
+                      <a:fillRect/>
+                    </a:stretch>
+                  </pic:blipFill>
+                  <pic:spPr>
+                    <a:xfrm>
+                      <a:off x="0" y="0"/>
+                      <a:ext cx="5271770" cy="1023620"/>
+                    </a:xfrm>
+                    <a:prstGeom prst="rect">
+                      <a:avLst/>
+                    </a:prstGeom>
+                    <a:noFill/>
+                    <a:ln>
+                      <a:noFill/>
+                    </a:ln>
+                  </pic:spPr>
+                </pic:pic>
+              </a:graphicData>
+            </a:graphic>
+          </wp:inline>
+        </w:drawing>
+      </w:r>
+    </w:p>
+    <w:p>
+      <w:pPr>
+        <w:keepNext w:val="0"/>
+        <w:keepLines w:val="0"/>
+        <w:widowControl/>
+        <w:numPr>
+          <w:ilvl w:val="1"/>
+          <w:numId w:val="11"/>
+        </w:numPr>
+        <w:suppressLineNumbers w:val="0"/>
+        <w:spacing w:before="0" w:beforeAutospacing="0" w:after="0" w:afterAutospacing="0" w:line="360" w:lineRule="auto"/>
+        <w:ind w:left="840" w:leftChars="0" w:right="0" w:hanging="420" w:firstLineChars="0"/>
+        <w:jc w:val="left"/>
+        <w:rPr>
+          <w:rFonts w:hint="default" w:ascii="Bodoni MT" w:hAnsi="Bodoni MT" w:cs="Bodoni MT"/>
+        </w:rPr>
+      </w:pPr>
+      <w:r>
+        <w:rPr>
+          <w:rFonts w:hint="default" w:ascii="Bodoni MT" w:hAnsi="Bodoni MT" w:cs="Bodoni MT"/>
+          <w:b w:val="0"/>
+          <w:bCs w:val="0"/>
+          <w:i w:val="0"/>
+          <w:iCs w:val="0"/>
+          <w:lang w:val="en-IN"/>
+        </w:rPr>
+        <w:t xml:space="preserve">All the server contains this end-point to talk to [because all talk to </w:t>
+      </w:r>
+      <w:r>
+        <w:rPr>
+          <w:rFonts w:hint="default" w:ascii="Bodoni MT" w:hAnsi="Bodoni MT" w:cs="Bodoni MT"/>
+          <w:b w:val="0"/>
+          <w:bCs w:val="0"/>
+          <w:i/>
+          <w:iCs/>
+          <w:lang w:val="en-IN"/>
+        </w:rPr>
+        <w:t>API Server</w:t>
+      </w:r>
+      <w:r>
+        <w:rPr>
+          <w:rFonts w:hint="default" w:ascii="Bodoni MT" w:hAnsi="Bodoni MT" w:cs="Bodoni MT"/>
+          <w:b w:val="0"/>
+          <w:bCs w:val="0"/>
+          <w:i w:val="0"/>
+          <w:iCs w:val="0"/>
+          <w:lang w:val="en-IN"/>
+        </w:rPr>
+        <w:t xml:space="preserve"> only]</w:t>
+      </w:r>
+      <w:r>
+        <w:rPr>
+          <w:rFonts w:hint="default" w:ascii="Bodoni MT" w:hAnsi="Bodoni MT" w:cs="Bodoni MT"/>
+          <w:b w:val="0"/>
+          <w:bCs w:val="0"/>
+          <w:i w:val="0"/>
+          <w:iCs w:val="0"/>
+          <w:lang w:val="en-IN"/>
+        </w:rPr>
+        <w:br w:type="textWrapping"/>
+      </w:r>
+      <w:r>
+        <w:rPr>
+          <w:rFonts w:hint="default" w:ascii="Bodoni MT" w:hAnsi="Bodoni MT" w:cs="Bodoni MT"/>
+          <w:b w:val="0"/>
+          <w:bCs w:val="0"/>
+          <w:i w:val="0"/>
+          <w:iCs w:val="0"/>
+          <w:lang w:val="en-IN"/>
+        </w:rPr>
+        <w:t xml:space="preserve">And, all the communication happens </w:t>
+      </w:r>
+      <w:r>
+        <w:rPr>
+          <w:rFonts w:hint="default" w:ascii="Bodoni MT" w:hAnsi="Bodoni MT" w:cs="Bodoni MT"/>
+          <w:b w:val="0"/>
+          <w:bCs w:val="0"/>
+          <w:i w:val="0"/>
+          <w:iCs w:val="0"/>
+          <w:color w:val="7030A0"/>
+          <w:shd w:val="clear" w:color="FFFFFF" w:fill="D9D9D9"/>
+          <w:lang w:val="en-IN"/>
+        </w:rPr>
+        <w:t xml:space="preserve">via </w:t>
+      </w:r>
+      <w:r>
+        <w:rPr>
+          <w:rFonts w:hint="default" w:ascii="Bodoni MT" w:hAnsi="Bodoni MT" w:cs="Bodoni MT"/>
+          <w:b w:val="0"/>
+          <w:bCs w:val="0"/>
+          <w:i/>
+          <w:iCs/>
+          <w:color w:val="7030A0"/>
+          <w:shd w:val="clear" w:color="FFFFFF" w:fill="D9D9D9"/>
+          <w:lang w:val="en-IN"/>
+        </w:rPr>
+        <w:t>HTTP Calls</w:t>
+      </w:r>
+      <w:r>
+        <w:rPr>
+          <w:rFonts w:hint="default" w:ascii="Bodoni MT" w:hAnsi="Bodoni MT" w:cs="Bodoni MT"/>
+          <w:b w:val="0"/>
+          <w:bCs w:val="0"/>
+          <w:i w:val="0"/>
+          <w:iCs w:val="0"/>
+          <w:lang w:val="en-IN"/>
+        </w:rPr>
+        <w:t>.</w:t>
+      </w:r>
+    </w:p>
+    <w:p>
+      <w:pPr>
+        <w:keepNext w:val="0"/>
+        <w:keepLines w:val="0"/>
+        <w:widowControl/>
+        <w:numPr>
+          <w:ilvl w:val="1"/>
+          <w:numId w:val="11"/>
+        </w:numPr>
+        <w:suppressLineNumbers w:val="0"/>
+        <w:spacing w:before="0" w:beforeAutospacing="0" w:after="0" w:afterAutospacing="0" w:line="360" w:lineRule="auto"/>
+        <w:ind w:left="840" w:leftChars="0" w:right="0" w:hanging="420" w:firstLineChars="0"/>
+        <w:jc w:val="left"/>
+        <w:rPr>
+          <w:rFonts w:hint="default" w:ascii="Bodoni MT" w:hAnsi="Bodoni MT" w:cs="Bodoni MT"/>
+        </w:rPr>
+      </w:pPr>
+      <w:r>
+        <w:rPr>
+          <w:rFonts w:hint="default" w:ascii="Bodoni MT" w:hAnsi="Bodoni MT" w:cs="Bodoni MT"/>
+          <w:lang w:val="en-IN"/>
+        </w:rPr>
+        <w:t xml:space="preserve">This is how the communication and work happens in </w:t>
+      </w:r>
+      <w:r>
+        <w:rPr>
+          <w:rFonts w:hint="default" w:ascii="Bodoni MT" w:hAnsi="Bodoni MT" w:cs="Bodoni MT"/>
+          <w:b/>
+          <w:bCs/>
+          <w:i/>
+          <w:iCs/>
+          <w:lang w:val="en-IN"/>
+        </w:rPr>
+        <w:t>control plane</w:t>
+      </w:r>
+      <w:r>
+        <w:rPr>
+          <w:rFonts w:hint="default" w:ascii="Bodoni MT" w:hAnsi="Bodoni MT" w:cs="Bodoni MT"/>
+          <w:b w:val="0"/>
+          <w:bCs w:val="0"/>
+          <w:i w:val="0"/>
+          <w:iCs w:val="0"/>
+          <w:lang w:val="en-IN"/>
+        </w:rPr>
+        <w:t xml:space="preserve"> nodes.</w:t>
       </w:r>
     </w:p>
     <w:p>
@@ -32775,14 +34052,961 @@
         <w:jc w:val="left"/>
         <w:rPr>
           <w:rFonts w:hint="default" w:ascii="Bodoni MT" w:hAnsi="Bodoni MT" w:cs="Bodoni MT"/>
-        </w:rPr>
-      </w:pPr>
-      <w:r>
-        <w:rPr>
-          <w:rFonts w:hint="default" w:ascii="Bodoni MT" w:hAnsi="Bodoni MT" w:cs="Bodoni MT"/>
-          <w:lang w:val="en-IN"/>
-        </w:rPr>
-        <w:t>F</w:t>
+          <w:b/>
+          <w:bCs/>
+          <w:u w:val="single"/>
+        </w:rPr>
+      </w:pPr>
+      <w:r>
+        <w:rPr>
+          <w:rFonts w:hint="default" w:ascii="Bodoni MT" w:hAnsi="Bodoni MT" w:cs="Bodoni MT"/>
+          <w:b/>
+          <w:bCs/>
+          <w:i w:val="0"/>
+          <w:iCs w:val="0"/>
+          <w:u w:val="single"/>
+          <w:lang w:val="en-IN"/>
+        </w:rPr>
+        <w:t>Now, how the resources behaves when all are present inside Pods</w:t>
+      </w:r>
+    </w:p>
+    <w:p>
+      <w:pPr>
+        <w:keepNext w:val="0"/>
+        <w:keepLines w:val="0"/>
+        <w:widowControl/>
+        <w:numPr>
+          <w:ilvl w:val="1"/>
+          <w:numId w:val="11"/>
+        </w:numPr>
+        <w:suppressLineNumbers w:val="0"/>
+        <w:spacing w:before="0" w:beforeAutospacing="0" w:after="0" w:afterAutospacing="0" w:line="360" w:lineRule="auto"/>
+        <w:ind w:left="840" w:leftChars="0" w:right="0" w:hanging="420" w:firstLineChars="0"/>
+        <w:jc w:val="left"/>
+        <w:rPr>
+          <w:rFonts w:hint="default" w:ascii="Bodoni MT" w:hAnsi="Bodoni MT" w:cs="Bodoni MT"/>
+        </w:rPr>
+      </w:pPr>
+      <w:r>
+        <w:rPr>
+          <w:rFonts w:hint="default" w:ascii="Bodoni MT" w:hAnsi="Bodoni MT" w:cs="Bodoni MT"/>
+          <w:lang w:val="en-IN"/>
+        </w:rPr>
+        <w:t xml:space="preserve">As we saw, all the resources communication happens via </w:t>
+      </w:r>
+      <w:r>
+        <w:rPr>
+          <w:rFonts w:hint="default" w:ascii="Bodoni MT" w:hAnsi="Bodoni MT" w:cs="Bodoni MT"/>
+          <w:i/>
+          <w:iCs/>
+          <w:lang w:val="en-IN"/>
+        </w:rPr>
+        <w:t>HTTP Calls</w:t>
+      </w:r>
+      <w:r>
+        <w:rPr>
+          <w:rFonts w:hint="default" w:ascii="Bodoni MT" w:hAnsi="Bodoni MT" w:cs="Bodoni MT"/>
+          <w:i w:val="0"/>
+          <w:iCs w:val="0"/>
+          <w:lang w:val="en-IN"/>
+        </w:rPr>
+        <w:t xml:space="preserve"> only.</w:t>
+      </w:r>
+      <w:r>
+        <w:rPr>
+          <w:rFonts w:hint="default" w:ascii="Bodoni MT" w:hAnsi="Bodoni MT" w:cs="Bodoni MT"/>
+          <w:i w:val="0"/>
+          <w:iCs w:val="0"/>
+          <w:lang w:val="en-IN"/>
+        </w:rPr>
+        <w:br w:type="textWrapping"/>
+      </w:r>
+      <w:r>
+        <w:rPr>
+          <w:rFonts w:hint="default" w:ascii="Bodoni MT" w:hAnsi="Bodoni MT" w:cs="Bodoni MT"/>
+          <w:i w:val="0"/>
+          <w:iCs w:val="0"/>
+          <w:lang w:val="en-IN"/>
+        </w:rPr>
+        <w:t>So, even if they are present inside the pods, there will some port mapping like</w:t>
+      </w:r>
+      <w:r>
+        <w:rPr>
+          <w:rFonts w:hint="default" w:ascii="Bodoni MT" w:hAnsi="Bodoni MT" w:cs="Bodoni MT"/>
+          <w:i w:val="0"/>
+          <w:iCs w:val="0"/>
+          <w:lang w:val="en-IN"/>
+        </w:rPr>
+        <w:br w:type="textWrapping"/>
+      </w:r>
+      <w:r>
+        <w:rPr>
+          <w:rFonts w:hint="default" w:ascii="Bodoni MT" w:hAnsi="Bodoni MT" w:cs="Bodoni MT"/>
+          <w:i/>
+          <w:iCs/>
+          <w:lang w:val="en-IN"/>
+        </w:rPr>
+        <w:t>6443:6443</w:t>
+      </w:r>
+      <w:r>
+        <w:rPr>
+          <w:rFonts w:hint="default" w:ascii="Bodoni MT" w:hAnsi="Bodoni MT" w:cs="Bodoni MT"/>
+          <w:i w:val="0"/>
+          <w:iCs w:val="0"/>
+          <w:lang w:val="en-IN"/>
+        </w:rPr>
+        <w:t xml:space="preserve">   (just example)</w:t>
+      </w:r>
+    </w:p>
+    <w:p>
+      <w:pPr>
+        <w:keepNext w:val="0"/>
+        <w:keepLines w:val="0"/>
+        <w:widowControl/>
+        <w:numPr>
+          <w:ilvl w:val="1"/>
+          <w:numId w:val="11"/>
+        </w:numPr>
+        <w:suppressLineNumbers w:val="0"/>
+        <w:spacing w:before="0" w:beforeAutospacing="0" w:after="0" w:afterAutospacing="0" w:line="360" w:lineRule="auto"/>
+        <w:ind w:left="840" w:leftChars="0" w:right="0" w:hanging="420" w:firstLineChars="0"/>
+        <w:jc w:val="left"/>
+        <w:rPr>
+          <w:rFonts w:hint="default" w:ascii="Bodoni MT" w:hAnsi="Bodoni MT" w:cs="Bodoni MT"/>
+        </w:rPr>
+      </w:pPr>
+      <w:r>
+        <w:rPr>
+          <w:rFonts w:hint="default" w:ascii="Bodoni MT" w:hAnsi="Bodoni MT" w:cs="Bodoni MT"/>
+          <w:i w:val="0"/>
+          <w:iCs w:val="0"/>
+          <w:lang w:val="en-IN"/>
+        </w:rPr>
+        <w:t>So, nothing changes. All the end-points remains same.</w:t>
+      </w:r>
+    </w:p>
+    <w:p>
+      <w:pPr>
+        <w:keepNext w:val="0"/>
+        <w:keepLines w:val="0"/>
+        <w:widowControl/>
+        <w:numPr>
+          <w:ilvl w:val="1"/>
+          <w:numId w:val="11"/>
+        </w:numPr>
+        <w:suppressLineNumbers w:val="0"/>
+        <w:spacing w:before="0" w:beforeAutospacing="0" w:after="0" w:afterAutospacing="0" w:line="360" w:lineRule="auto"/>
+        <w:ind w:left="840" w:leftChars="0" w:right="0" w:hanging="420" w:firstLineChars="0"/>
+        <w:jc w:val="left"/>
+        <w:rPr>
+          <w:rFonts w:hint="default" w:ascii="Bodoni MT" w:hAnsi="Bodoni MT" w:cs="Bodoni MT"/>
+        </w:rPr>
+      </w:pPr>
+      <w:r>
+        <w:rPr>
+          <w:rFonts w:hint="default" w:ascii="Bodoni MT" w:hAnsi="Bodoni MT" w:cs="Bodoni MT"/>
+          <w:b/>
+          <w:bCs/>
+          <w:i/>
+          <w:iCs/>
+          <w:lang w:val="en-IN"/>
+        </w:rPr>
+        <w:t>kubeadm</w:t>
+      </w:r>
+      <w:r>
+        <w:rPr>
+          <w:rFonts w:hint="default" w:ascii="Bodoni MT" w:hAnsi="Bodoni MT" w:cs="Bodoni MT"/>
+          <w:b w:val="0"/>
+          <w:bCs w:val="0"/>
+          <w:i w:val="0"/>
+          <w:iCs w:val="0"/>
+          <w:lang w:val="en-IN"/>
+        </w:rPr>
+        <w:t xml:space="preserve"> keeps the same port mapping from host to pods, so the end-points doesn’t change.</w:t>
+      </w:r>
+      <w:r>
+        <w:rPr>
+          <w:rFonts w:hint="default" w:ascii="Bodoni MT" w:hAnsi="Bodoni MT" w:cs="Bodoni MT"/>
+          <w:b w:val="0"/>
+          <w:bCs w:val="0"/>
+          <w:i w:val="0"/>
+          <w:iCs w:val="0"/>
+          <w:lang w:val="en-IN"/>
+        </w:rPr>
+        <w:br w:type="textWrapping"/>
+      </w:r>
+      <w:r>
+        <w:rPr>
+          <w:rFonts w:hint="default" w:ascii="Bodoni MT" w:hAnsi="Bodoni MT" w:cs="Bodoni MT"/>
+          <w:b w:val="0"/>
+          <w:bCs w:val="0"/>
+          <w:i w:val="0"/>
+          <w:iCs w:val="0"/>
+          <w:lang w:val="en-IN"/>
+        </w:rPr>
+        <w:t xml:space="preserve">In case if you want to bind different host port to the pod, then </w:t>
+      </w:r>
+      <w:r>
+        <w:rPr>
+          <w:rFonts w:hint="default" w:ascii="Bodoni MT" w:hAnsi="Bodoni MT" w:cs="Bodoni MT"/>
+          <w:b/>
+          <w:bCs/>
+          <w:i/>
+          <w:iCs/>
+          <w:lang w:val="en-IN"/>
+        </w:rPr>
+        <w:t xml:space="preserve">configuration </w:t>
+      </w:r>
+      <w:r>
+        <w:rPr>
+          <w:rFonts w:hint="default" w:ascii="Bodoni MT" w:hAnsi="Bodoni MT" w:cs="Bodoni MT"/>
+          <w:b w:val="0"/>
+          <w:bCs w:val="0"/>
+          <w:i/>
+          <w:iCs/>
+          <w:lang w:val="en-IN"/>
+        </w:rPr>
+        <w:t>files needs to be updated with this</w:t>
+      </w:r>
+      <w:r>
+        <w:rPr>
+          <w:rFonts w:hint="default" w:ascii="Bodoni MT" w:hAnsi="Bodoni MT" w:cs="Bodoni MT"/>
+          <w:b w:val="0"/>
+          <w:bCs w:val="0"/>
+          <w:i w:val="0"/>
+          <w:iCs w:val="0"/>
+          <w:lang w:val="en-IN"/>
+        </w:rPr>
+        <w:t>.</w:t>
+      </w:r>
+      <w:r>
+        <w:rPr>
+          <w:rFonts w:hint="default" w:ascii="Bodoni MT" w:hAnsi="Bodoni MT" w:cs="Bodoni MT"/>
+          <w:b w:val="0"/>
+          <w:bCs w:val="0"/>
+          <w:i w:val="0"/>
+          <w:iCs w:val="0"/>
+          <w:lang w:val="en-IN"/>
+        </w:rPr>
+        <w:br w:type="textWrapping"/>
+      </w:r>
+      <w:r>
+        <w:rPr>
+          <w:rFonts w:hint="default" w:ascii="Bodoni MT" w:hAnsi="Bodoni MT" w:cs="Bodoni MT"/>
+          <w:b w:val="0"/>
+          <w:bCs w:val="0"/>
+          <w:i w:val="0"/>
+          <w:iCs w:val="0"/>
+          <w:lang w:val="en-IN"/>
+        </w:rPr>
+        <w:t>And, all of the things will work now.</w:t>
+      </w:r>
+    </w:p>
+    <w:p>
+      <w:pPr>
+        <w:keepNext w:val="0"/>
+        <w:keepLines w:val="0"/>
+        <w:widowControl/>
+        <w:numPr>
+          <w:ilvl w:val="1"/>
+          <w:numId w:val="11"/>
+        </w:numPr>
+        <w:suppressLineNumbers w:val="0"/>
+        <w:spacing w:before="0" w:beforeAutospacing="0" w:after="0" w:afterAutospacing="0" w:line="360" w:lineRule="auto"/>
+        <w:ind w:left="840" w:leftChars="0" w:right="0" w:hanging="420" w:firstLineChars="0"/>
+        <w:jc w:val="left"/>
+        <w:rPr>
+          <w:rFonts w:hint="default" w:ascii="Bodoni MT" w:hAnsi="Bodoni MT" w:cs="Bodoni MT"/>
+        </w:rPr>
+      </w:pPr>
+      <w:r>
+        <w:rPr>
+          <w:rFonts w:hint="default" w:ascii="Bodoni MT" w:hAnsi="Bodoni MT" w:cs="Bodoni MT"/>
+          <w:b/>
+          <w:bCs/>
+          <w:i/>
+          <w:iCs/>
+          <w:lang w:val="en-IN"/>
+        </w:rPr>
+        <w:t>kubeadm</w:t>
+      </w:r>
+      <w:r>
+        <w:rPr>
+          <w:rFonts w:hint="default" w:ascii="Bodoni MT" w:hAnsi="Bodoni MT" w:cs="Bodoni MT"/>
+          <w:b w:val="0"/>
+          <w:bCs w:val="0"/>
+          <w:i w:val="0"/>
+          <w:iCs w:val="0"/>
+          <w:lang w:val="en-IN"/>
+        </w:rPr>
+        <w:t xml:space="preserve"> runs all the resources in </w:t>
+      </w:r>
+      <w:r>
+        <w:rPr>
+          <w:rFonts w:hint="default" w:ascii="Bodoni MT" w:hAnsi="Bodoni MT" w:cs="Bodoni MT"/>
+          <w:b/>
+          <w:bCs/>
+          <w:i/>
+          <w:iCs/>
+          <w:lang w:val="en-IN"/>
+        </w:rPr>
+        <w:t>static pods</w:t>
+      </w:r>
+      <w:r>
+        <w:rPr>
+          <w:rFonts w:hint="default" w:ascii="Bodoni MT" w:hAnsi="Bodoni MT" w:cs="Bodoni MT"/>
+          <w:b w:val="0"/>
+          <w:bCs w:val="0"/>
+          <w:i w:val="0"/>
+          <w:iCs w:val="0"/>
+          <w:lang w:val="en-IN"/>
+        </w:rPr>
+        <w:t xml:space="preserve"> (not normal pods).</w:t>
+      </w:r>
+      <w:r>
+        <w:rPr>
+          <w:rFonts w:hint="default" w:ascii="Bodoni MT" w:hAnsi="Bodoni MT" w:cs="Bodoni MT"/>
+          <w:b w:val="0"/>
+          <w:bCs w:val="0"/>
+          <w:i w:val="0"/>
+          <w:iCs w:val="0"/>
+          <w:lang w:val="en-IN"/>
+        </w:rPr>
+        <w:br w:type="textWrapping"/>
+      </w:r>
+      <w:r>
+        <w:rPr>
+          <w:rFonts w:hint="default" w:ascii="Bodoni MT" w:hAnsi="Bodoni MT" w:cs="Bodoni MT"/>
+          <w:b w:val="0"/>
+          <w:bCs w:val="0"/>
+          <w:i w:val="0"/>
+          <w:iCs w:val="0"/>
+          <w:lang w:val="en-IN"/>
+        </w:rPr>
+        <w:t xml:space="preserve">So, </w:t>
+      </w:r>
+      <w:r>
+        <w:rPr>
+          <w:rFonts w:hint="default" w:ascii="Bodoni MT" w:hAnsi="Bodoni MT" w:cs="Bodoni MT"/>
+          <w:b w:val="0"/>
+          <w:bCs w:val="0"/>
+          <w:i/>
+          <w:iCs/>
+          <w:lang w:val="en-IN"/>
+        </w:rPr>
+        <w:t>API Server</w:t>
+      </w:r>
+      <w:r>
+        <w:rPr>
+          <w:rFonts w:hint="default" w:ascii="Bodoni MT" w:hAnsi="Bodoni MT" w:cs="Bodoni MT"/>
+          <w:b w:val="0"/>
+          <w:bCs w:val="0"/>
+          <w:i w:val="0"/>
+          <w:iCs w:val="0"/>
+          <w:lang w:val="en-IN"/>
+        </w:rPr>
+        <w:t xml:space="preserve"> or </w:t>
+      </w:r>
+      <w:r>
+        <w:rPr>
+          <w:rFonts w:hint="default" w:ascii="Bodoni MT" w:hAnsi="Bodoni MT" w:cs="Bodoni MT"/>
+          <w:b w:val="0"/>
+          <w:bCs w:val="0"/>
+          <w:i/>
+          <w:iCs/>
+          <w:lang w:val="en-IN"/>
+        </w:rPr>
+        <w:t>etcd</w:t>
+      </w:r>
+      <w:r>
+        <w:rPr>
+          <w:rFonts w:hint="default" w:ascii="Bodoni MT" w:hAnsi="Bodoni MT" w:cs="Bodoni MT"/>
+          <w:b w:val="0"/>
+          <w:bCs w:val="0"/>
+          <w:i w:val="0"/>
+          <w:iCs w:val="0"/>
+          <w:lang w:val="en-IN"/>
+        </w:rPr>
+        <w:t xml:space="preserve"> has nothing to do with this.</w:t>
+      </w:r>
+      <w:r>
+        <w:rPr>
+          <w:rFonts w:hint="default" w:ascii="Bodoni MT" w:hAnsi="Bodoni MT" w:cs="Bodoni MT"/>
+          <w:b w:val="0"/>
+          <w:bCs w:val="0"/>
+          <w:i w:val="0"/>
+          <w:iCs w:val="0"/>
+          <w:lang w:val="en-IN"/>
+        </w:rPr>
+        <w:br w:type="textWrapping"/>
+      </w:r>
+      <w:r>
+        <w:rPr>
+          <w:rFonts w:hint="default" w:ascii="Bodoni MT" w:hAnsi="Bodoni MT" w:cs="Bodoni MT"/>
+          <w:b/>
+          <w:bCs/>
+          <w:i w:val="0"/>
+          <w:iCs w:val="0"/>
+          <w:lang w:val="en-IN"/>
+        </w:rPr>
+        <w:t>[[[</w:t>
+      </w:r>
+      <w:r>
+        <w:rPr>
+          <w:rFonts w:hint="default" w:ascii="Bodoni MT" w:hAnsi="Bodoni MT" w:cs="Bodoni MT"/>
+          <w:b w:val="0"/>
+          <w:bCs w:val="0"/>
+          <w:i w:val="0"/>
+          <w:iCs w:val="0"/>
+          <w:lang w:val="en-IN"/>
+        </w:rPr>
+        <w:t xml:space="preserve"> as we know, even if the pods are static, when you execute </w:t>
+      </w:r>
+      <w:r>
+        <w:rPr>
+          <w:rFonts w:hint="default" w:ascii="Bodoni MT" w:hAnsi="Bodoni MT" w:cs="Bodoni MT"/>
+          <w:b/>
+          <w:bCs/>
+          <w:i/>
+          <w:iCs/>
+          <w:lang w:val="en-IN"/>
+        </w:rPr>
+        <w:t>kubectl get pods</w:t>
+      </w:r>
+      <w:r>
+        <w:rPr>
+          <w:rFonts w:hint="default" w:ascii="Bodoni MT" w:hAnsi="Bodoni MT" w:cs="Bodoni MT"/>
+          <w:b w:val="0"/>
+          <w:bCs w:val="0"/>
+          <w:i w:val="0"/>
+          <w:iCs w:val="0"/>
+          <w:lang w:val="en-IN"/>
+        </w:rPr>
+        <w:t xml:space="preserve"> command you’ll be able to see the static pods because </w:t>
+      </w:r>
+      <w:r>
+        <w:rPr>
+          <w:rFonts w:hint="default" w:ascii="Bodoni MT" w:hAnsi="Bodoni MT" w:cs="Bodoni MT"/>
+          <w:b/>
+          <w:bCs/>
+          <w:i/>
+          <w:iCs/>
+          <w:lang w:val="en-IN"/>
+        </w:rPr>
+        <w:t>kubelet</w:t>
+      </w:r>
+      <w:r>
+        <w:rPr>
+          <w:rFonts w:hint="default" w:ascii="Bodoni MT" w:hAnsi="Bodoni MT" w:cs="Bodoni MT"/>
+          <w:b w:val="0"/>
+          <w:bCs w:val="0"/>
+          <w:i w:val="0"/>
+          <w:iCs w:val="0"/>
+          <w:lang w:val="en-IN"/>
+        </w:rPr>
+        <w:t xml:space="preserve"> informs </w:t>
+      </w:r>
+      <w:r>
+        <w:rPr>
+          <w:rFonts w:hint="default" w:ascii="Bodoni MT" w:hAnsi="Bodoni MT" w:cs="Bodoni MT"/>
+          <w:b w:val="0"/>
+          <w:bCs w:val="0"/>
+          <w:i/>
+          <w:iCs/>
+          <w:lang w:val="en-IN"/>
+        </w:rPr>
+        <w:t>API Server</w:t>
+      </w:r>
+      <w:r>
+        <w:rPr>
+          <w:rFonts w:hint="default" w:ascii="Bodoni MT" w:hAnsi="Bodoni MT" w:cs="Bodoni MT"/>
+          <w:b w:val="0"/>
+          <w:bCs w:val="0"/>
+          <w:i w:val="0"/>
+          <w:iCs w:val="0"/>
+          <w:lang w:val="en-IN"/>
+        </w:rPr>
+        <w:t xml:space="preserve"> about the static servers as well and </w:t>
+      </w:r>
+      <w:r>
+        <w:rPr>
+          <w:rFonts w:hint="default" w:ascii="Bodoni MT" w:hAnsi="Bodoni MT" w:cs="Bodoni MT"/>
+          <w:b w:val="0"/>
+          <w:bCs w:val="0"/>
+          <w:i/>
+          <w:iCs/>
+          <w:lang w:val="en-IN"/>
+        </w:rPr>
+        <w:t>API Server</w:t>
+      </w:r>
+      <w:r>
+        <w:rPr>
+          <w:rFonts w:hint="default" w:ascii="Bodoni MT" w:hAnsi="Bodoni MT" w:cs="Bodoni MT"/>
+          <w:b w:val="0"/>
+          <w:bCs w:val="0"/>
+          <w:i w:val="0"/>
+          <w:iCs w:val="0"/>
+          <w:lang w:val="en-IN"/>
+        </w:rPr>
+        <w:t xml:space="preserve"> stores the details about the </w:t>
+      </w:r>
+      <w:r>
+        <w:rPr>
+          <w:rFonts w:hint="default" w:ascii="Bodoni MT" w:hAnsi="Bodoni MT" w:cs="Bodoni MT"/>
+          <w:b w:val="0"/>
+          <w:bCs w:val="0"/>
+          <w:i/>
+          <w:iCs/>
+          <w:lang w:val="en-IN"/>
+        </w:rPr>
+        <w:t>static pods</w:t>
+      </w:r>
+      <w:r>
+        <w:rPr>
+          <w:rFonts w:hint="default" w:ascii="Bodoni MT" w:hAnsi="Bodoni MT" w:cs="Bodoni MT"/>
+          <w:b w:val="0"/>
+          <w:bCs w:val="0"/>
+          <w:i w:val="0"/>
+          <w:iCs w:val="0"/>
+          <w:lang w:val="en-IN"/>
+        </w:rPr>
+        <w:t xml:space="preserve"> inside </w:t>
+      </w:r>
+      <w:r>
+        <w:rPr>
+          <w:rFonts w:hint="default" w:ascii="Bodoni MT" w:hAnsi="Bodoni MT" w:cs="Bodoni MT"/>
+          <w:b/>
+          <w:bCs/>
+          <w:i/>
+          <w:iCs/>
+          <w:lang w:val="en-IN"/>
+        </w:rPr>
+        <w:t>etcd</w:t>
+      </w:r>
+      <w:r>
+        <w:rPr>
+          <w:rFonts w:hint="default" w:ascii="Bodoni MT" w:hAnsi="Bodoni MT" w:cs="Bodoni MT"/>
+          <w:b w:val="0"/>
+          <w:bCs w:val="0"/>
+          <w:i w:val="0"/>
+          <w:iCs w:val="0"/>
+          <w:lang w:val="en-IN"/>
+        </w:rPr>
+        <w:t xml:space="preserve">; but the </w:t>
+      </w:r>
+      <w:r>
+        <w:rPr>
+          <w:rFonts w:hint="default" w:ascii="Bodoni MT" w:hAnsi="Bodoni MT" w:cs="Bodoni MT"/>
+          <w:b w:val="0"/>
+          <w:bCs w:val="0"/>
+          <w:i/>
+          <w:iCs/>
+          <w:lang w:val="en-IN"/>
+        </w:rPr>
+        <w:t>static pods</w:t>
+      </w:r>
+      <w:r>
+        <w:rPr>
+          <w:rFonts w:hint="default" w:ascii="Bodoni MT" w:hAnsi="Bodoni MT" w:cs="Bodoni MT"/>
+          <w:b w:val="0"/>
+          <w:bCs w:val="0"/>
+          <w:i w:val="0"/>
+          <w:iCs w:val="0"/>
+          <w:lang w:val="en-IN"/>
+        </w:rPr>
+        <w:t xml:space="preserve"> are having 2 extra fields inside </w:t>
+      </w:r>
+      <w:r>
+        <w:rPr>
+          <w:rFonts w:hint="default" w:ascii="Bodoni MT" w:hAnsi="Bodoni MT" w:cs="Bodoni MT"/>
+          <w:b/>
+          <w:bCs/>
+          <w:i/>
+          <w:iCs/>
+          <w:lang w:val="en-IN"/>
+        </w:rPr>
+        <w:t>annotations</w:t>
+      </w:r>
+      <w:r>
+        <w:rPr>
+          <w:rFonts w:hint="default" w:ascii="Bodoni MT" w:hAnsi="Bodoni MT" w:cs="Bodoni MT"/>
+          <w:b w:val="0"/>
+          <w:bCs w:val="0"/>
+          <w:i w:val="0"/>
+          <w:iCs w:val="0"/>
+          <w:lang w:val="en-IN"/>
+        </w:rPr>
+        <w:t xml:space="preserve"> which are </w:t>
+      </w:r>
+      <w:r>
+        <w:rPr>
+          <w:rFonts w:hint="default" w:ascii="Bodoni MT" w:hAnsi="Bodoni MT" w:cs="Bodoni MT"/>
+          <w:b w:val="0"/>
+          <w:bCs w:val="0"/>
+          <w:i/>
+          <w:iCs/>
+          <w:u w:val="single"/>
+          <w:lang w:val="en-IN"/>
+        </w:rPr>
+        <w:t>config.mirror: &lt;hash&gt;</w:t>
+      </w:r>
+      <w:r>
+        <w:rPr>
+          <w:rFonts w:hint="default" w:ascii="Bodoni MT" w:hAnsi="Bodoni MT" w:cs="Bodoni MT"/>
+          <w:b w:val="0"/>
+          <w:bCs w:val="0"/>
+          <w:i w:val="0"/>
+          <w:iCs w:val="0"/>
+          <w:lang w:val="en-IN"/>
+        </w:rPr>
+        <w:t xml:space="preserve"> and </w:t>
+      </w:r>
+      <w:r>
+        <w:rPr>
+          <w:rFonts w:hint="default" w:ascii="Bodoni MT" w:hAnsi="Bodoni MT" w:cs="Bodoni MT"/>
+          <w:b w:val="0"/>
+          <w:bCs w:val="0"/>
+          <w:i/>
+          <w:iCs/>
+          <w:u w:val="single"/>
+          <w:lang w:val="en-IN"/>
+        </w:rPr>
+        <w:t>config.source: file</w:t>
+      </w:r>
+      <w:r>
+        <w:rPr>
+          <w:rFonts w:hint="default" w:ascii="Bodoni MT" w:hAnsi="Bodoni MT" w:cs="Bodoni MT"/>
+          <w:b w:val="0"/>
+          <w:bCs w:val="0"/>
+          <w:i w:val="0"/>
+          <w:iCs w:val="0"/>
+          <w:lang w:val="en-IN"/>
+        </w:rPr>
+        <w:t xml:space="preserve"> </w:t>
+      </w:r>
+      <w:r>
+        <w:rPr>
+          <w:rFonts w:hint="default" w:ascii="Bodoni MT" w:hAnsi="Bodoni MT" w:cs="Bodoni MT"/>
+          <w:b/>
+          <w:bCs/>
+          <w:i w:val="0"/>
+          <w:iCs w:val="0"/>
+          <w:lang w:val="en-IN"/>
+        </w:rPr>
+        <w:t>]]]</w:t>
+      </w:r>
+      <w:r>
+        <w:rPr>
+          <w:rFonts w:hint="default" w:ascii="Bodoni MT" w:hAnsi="Bodoni MT" w:cs="Bodoni MT"/>
+          <w:b w:val="0"/>
+          <w:bCs w:val="0"/>
+          <w:i w:val="0"/>
+          <w:iCs w:val="0"/>
+          <w:lang w:val="en-IN"/>
+        </w:rPr>
+        <w:br w:type="textWrapping"/>
+      </w:r>
+      <w:r>
+        <w:rPr>
+          <w:rFonts w:hint="default" w:ascii="Bodoni MT" w:hAnsi="Bodoni MT" w:cs="Bodoni MT"/>
+          <w:b w:val="0"/>
+          <w:bCs w:val="0"/>
+          <w:i w:val="0"/>
+          <w:iCs w:val="0"/>
+          <w:lang w:val="en-IN"/>
+        </w:rPr>
+        <w:t xml:space="preserve">when you see the details about the </w:t>
+      </w:r>
+      <w:r>
+        <w:rPr>
+          <w:rFonts w:hint="default" w:ascii="Bodoni MT" w:hAnsi="Bodoni MT" w:cs="Bodoni MT"/>
+          <w:b w:val="0"/>
+          <w:bCs w:val="0"/>
+          <w:i/>
+          <w:iCs/>
+          <w:lang w:val="en-IN"/>
+        </w:rPr>
+        <w:t>resources pods</w:t>
+      </w:r>
+      <w:r>
+        <w:rPr>
+          <w:rFonts w:hint="default" w:ascii="Bodoni MT" w:hAnsi="Bodoni MT" w:cs="Bodoni MT"/>
+          <w:b w:val="0"/>
+          <w:bCs w:val="0"/>
+          <w:i w:val="0"/>
+          <w:iCs w:val="0"/>
+          <w:lang w:val="en-IN"/>
+        </w:rPr>
+        <w:t xml:space="preserve">, you’ll find the fields inside </w:t>
+      </w:r>
+      <w:r>
+        <w:rPr>
+          <w:rFonts w:hint="default" w:ascii="Bodoni MT" w:hAnsi="Bodoni MT" w:cs="Bodoni MT"/>
+          <w:b w:val="0"/>
+          <w:bCs w:val="0"/>
+          <w:i/>
+          <w:iCs/>
+          <w:lang w:val="en-IN"/>
+        </w:rPr>
+        <w:t>annotations</w:t>
+      </w:r>
+      <w:r>
+        <w:rPr>
+          <w:rFonts w:hint="default" w:ascii="Bodoni MT" w:hAnsi="Bodoni MT" w:cs="Bodoni MT"/>
+          <w:b w:val="0"/>
+          <w:bCs w:val="0"/>
+          <w:i w:val="0"/>
+          <w:iCs w:val="0"/>
+          <w:lang w:val="en-IN"/>
+        </w:rPr>
+        <w:t>.</w:t>
+      </w:r>
+      <w:r>
+        <w:rPr>
+          <w:rFonts w:hint="default" w:ascii="Bodoni MT" w:hAnsi="Bodoni MT" w:cs="Bodoni MT"/>
+          <w:b w:val="0"/>
+          <w:bCs w:val="0"/>
+          <w:i w:val="0"/>
+          <w:iCs w:val="0"/>
+          <w:lang w:val="en-IN"/>
+        </w:rPr>
+        <w:br w:type="textWrapping"/>
+      </w:r>
+      <w:r>
+        <w:rPr>
+          <w:rFonts w:hint="default" w:ascii="Bodoni MT" w:hAnsi="Bodoni MT" w:cs="Bodoni MT"/>
+        </w:rPr>
+        <w:drawing>
+          <wp:inline distT="0" distB="0" distL="114300" distR="114300">
+            <wp:extent cx="4531995" cy="996315"/>
+            <wp:effectExtent l="0" t="0" r="1905" b="6985"/>
+            <wp:docPr id="34" name="Picture 6"/>
+            <wp:cNvGraphicFramePr>
+              <a:graphicFrameLocks xmlns:a="http://schemas.openxmlformats.org/drawingml/2006/main" noChangeAspect="1"/>
+            </wp:cNvGraphicFramePr>
+            <a:graphic xmlns:a="http://schemas.openxmlformats.org/drawingml/2006/main">
+              <a:graphicData uri="http://schemas.openxmlformats.org/drawingml/2006/picture">
+                <pic:pic xmlns:pic="http://schemas.openxmlformats.org/drawingml/2006/picture">
+                  <pic:nvPicPr>
+                    <pic:cNvPr id="34" name="Picture 6"/>
+                    <pic:cNvPicPr>
+                      <a:picLocks noChangeAspect="1"/>
+                    </pic:cNvPicPr>
+                  </pic:nvPicPr>
+                  <pic:blipFill>
+                    <a:blip r:embed="rId108"/>
+                    <a:stretch>
+                      <a:fillRect/>
+                    </a:stretch>
+                  </pic:blipFill>
+                  <pic:spPr>
+                    <a:xfrm>
+                      <a:off x="0" y="0"/>
+                      <a:ext cx="4531995" cy="996315"/>
+                    </a:xfrm>
+                    <a:prstGeom prst="rect">
+                      <a:avLst/>
+                    </a:prstGeom>
+                    <a:noFill/>
+                    <a:ln>
+                      <a:noFill/>
+                    </a:ln>
+                  </pic:spPr>
+                </pic:pic>
+              </a:graphicData>
+            </a:graphic>
+          </wp:inline>
+        </w:drawing>
+      </w:r>
+      <w:r>
+        <w:rPr>
+          <w:rFonts w:hint="default" w:ascii="Bodoni MT" w:hAnsi="Bodoni MT" w:cs="Bodoni MT"/>
+        </w:rPr>
+        <w:br w:type="textWrapping"/>
+      </w:r>
+      <w:r>
+        <w:rPr>
+          <w:rFonts w:hint="default" w:ascii="Bodoni MT" w:hAnsi="Bodoni MT" w:cs="Bodoni MT"/>
+          <w:lang w:val="en-IN"/>
+        </w:rPr>
+        <w:t>(kube-scheduler pod)</w:t>
+      </w:r>
+    </w:p>
+    <w:p>
+      <w:pPr>
+        <w:keepNext w:val="0"/>
+        <w:keepLines w:val="0"/>
+        <w:widowControl/>
+        <w:numPr>
+          <w:ilvl w:val="1"/>
+          <w:numId w:val="11"/>
+        </w:numPr>
+        <w:suppressLineNumbers w:val="0"/>
+        <w:spacing w:before="0" w:beforeAutospacing="0" w:after="0" w:afterAutospacing="0" w:line="360" w:lineRule="auto"/>
+        <w:ind w:left="840" w:leftChars="0" w:right="0" w:hanging="420" w:firstLineChars="0"/>
+        <w:jc w:val="left"/>
+        <w:rPr>
+          <w:rFonts w:hint="default" w:ascii="Bodoni MT" w:hAnsi="Bodoni MT" w:cs="Bodoni MT"/>
+        </w:rPr>
+      </w:pPr>
+      <w:r>
+        <w:rPr>
+          <w:rFonts w:hint="default" w:ascii="Bodoni MT" w:hAnsi="Bodoni MT" w:cs="Bodoni MT"/>
+          <w:lang w:val="en-IN"/>
+        </w:rPr>
+        <w:t xml:space="preserve">So, API Server cannot update these pods because </w:t>
+      </w:r>
+      <w:r>
+        <w:rPr>
+          <w:rFonts w:hint="default" w:ascii="Bodoni MT" w:hAnsi="Bodoni MT" w:cs="Bodoni MT"/>
+          <w:i/>
+          <w:iCs/>
+          <w:lang w:val="en-IN"/>
+        </w:rPr>
+        <w:t>static pod</w:t>
+      </w:r>
+      <w:r>
+        <w:rPr>
+          <w:rFonts w:hint="default" w:ascii="Bodoni MT" w:hAnsi="Bodoni MT" w:cs="Bodoni MT"/>
+          <w:i w:val="0"/>
+          <w:iCs w:val="0"/>
+          <w:lang w:val="en-IN"/>
+        </w:rPr>
+        <w:t xml:space="preserve"> can only be updated if you change the </w:t>
+      </w:r>
+      <w:r>
+        <w:rPr>
+          <w:rFonts w:hint="default" w:ascii="Bodoni MT" w:hAnsi="Bodoni MT" w:cs="Bodoni MT"/>
+          <w:b/>
+          <w:bCs/>
+          <w:i/>
+          <w:iCs/>
+          <w:lang w:val="en-IN"/>
+        </w:rPr>
+        <w:t xml:space="preserve">yaml </w:t>
+      </w:r>
+      <w:r>
+        <w:rPr>
+          <w:rFonts w:hint="default" w:ascii="Bodoni MT" w:hAnsi="Bodoni MT" w:cs="Bodoni MT"/>
+          <w:b w:val="0"/>
+          <w:bCs w:val="0"/>
+          <w:i w:val="0"/>
+          <w:iCs w:val="0"/>
+          <w:lang w:val="en-IN"/>
+        </w:rPr>
+        <w:t xml:space="preserve">files directly inside </w:t>
+      </w:r>
+      <w:r>
+        <w:rPr>
+          <w:rFonts w:hint="default" w:ascii="Bodoni MT" w:hAnsi="Bodoni MT" w:cs="Bodoni MT"/>
+          <w:b w:val="0"/>
+          <w:bCs w:val="0"/>
+          <w:i/>
+          <w:iCs/>
+          <w:lang w:val="en-IN"/>
+        </w:rPr>
+        <w:t>manifest</w:t>
+      </w:r>
+      <w:r>
+        <w:rPr>
+          <w:rFonts w:hint="default" w:ascii="Bodoni MT" w:hAnsi="Bodoni MT" w:cs="Bodoni MT"/>
+          <w:b w:val="0"/>
+          <w:bCs w:val="0"/>
+          <w:i w:val="0"/>
+          <w:iCs w:val="0"/>
+          <w:lang w:val="en-IN"/>
+        </w:rPr>
+        <w:t xml:space="preserve"> (or any directory configured) directory.</w:t>
+      </w:r>
+    </w:p>
+    <w:p>
+      <w:pPr>
+        <w:keepNext w:val="0"/>
+        <w:keepLines w:val="0"/>
+        <w:widowControl/>
+        <w:numPr>
+          <w:ilvl w:val="1"/>
+          <w:numId w:val="11"/>
+        </w:numPr>
+        <w:suppressLineNumbers w:val="0"/>
+        <w:spacing w:before="0" w:beforeAutospacing="0" w:after="0" w:afterAutospacing="0" w:line="360" w:lineRule="auto"/>
+        <w:ind w:left="840" w:leftChars="0" w:right="0" w:hanging="420" w:firstLineChars="0"/>
+        <w:jc w:val="left"/>
+        <w:rPr>
+          <w:rFonts w:hint="default" w:ascii="Bodoni MT" w:hAnsi="Bodoni MT" w:cs="Bodoni MT"/>
+          <w:color w:val="3B5F21" w:themeColor="accent4" w:themeShade="80"/>
+          <w:shd w:val="clear" w:color="FFFFFF" w:fill="D9D9D9"/>
+        </w:rPr>
+      </w:pPr>
+      <w:r>
+        <w:rPr>
+          <w:rFonts w:hint="default" w:ascii="Bodoni MT" w:hAnsi="Bodoni MT" w:cs="Bodoni MT"/>
+          <w:color w:val="3B5F21" w:themeColor="accent4" w:themeShade="80"/>
+          <w:shd w:val="clear" w:color="FFFFFF" w:fill="D9D9D9"/>
+          <w:lang w:val="en-IN"/>
+        </w:rPr>
+        <w:t xml:space="preserve">The main advantage of running the resources inside </w:t>
+      </w:r>
+      <w:r>
+        <w:rPr>
+          <w:rFonts w:hint="default" w:ascii="Bodoni MT" w:hAnsi="Bodoni MT" w:cs="Bodoni MT"/>
+          <w:i/>
+          <w:iCs/>
+          <w:color w:val="3B5F21" w:themeColor="accent4" w:themeShade="80"/>
+          <w:shd w:val="clear" w:color="FFFFFF" w:fill="D9D9D9"/>
+          <w:lang w:val="en-IN"/>
+        </w:rPr>
+        <w:t>static pods</w:t>
+      </w:r>
+      <w:r>
+        <w:rPr>
+          <w:rFonts w:hint="default" w:ascii="Bodoni MT" w:hAnsi="Bodoni MT" w:cs="Bodoni MT"/>
+          <w:i w:val="0"/>
+          <w:iCs w:val="0"/>
+          <w:color w:val="3B5F21" w:themeColor="accent4" w:themeShade="80"/>
+          <w:shd w:val="clear" w:color="FFFFFF" w:fill="D9D9D9"/>
+          <w:lang w:val="en-IN"/>
+        </w:rPr>
+        <w:t xml:space="preserve"> is if the pods crashes or the resources fails, </w:t>
+      </w:r>
+      <w:r>
+        <w:rPr>
+          <w:rFonts w:hint="default" w:ascii="Bodoni MT" w:hAnsi="Bodoni MT" w:cs="Bodoni MT"/>
+          <w:b w:val="0"/>
+          <w:bCs w:val="0"/>
+          <w:i w:val="0"/>
+          <w:iCs w:val="0"/>
+          <w:color w:val="3B5F21" w:themeColor="accent4" w:themeShade="80"/>
+          <w:shd w:val="clear" w:color="FFFFFF" w:fill="D9D9D9"/>
+          <w:lang w:val="en-IN"/>
+        </w:rPr>
+        <w:t xml:space="preserve">kubelet will </w:t>
+      </w:r>
+      <w:r>
+        <w:rPr>
+          <w:rFonts w:hint="default" w:ascii="Bodoni MT" w:hAnsi="Bodoni MT" w:cs="Bodoni MT"/>
+          <w:b/>
+          <w:bCs/>
+          <w:i w:val="0"/>
+          <w:iCs w:val="0"/>
+          <w:color w:val="3B5F21" w:themeColor="accent4" w:themeShade="80"/>
+          <w:shd w:val="clear" w:color="FFFFFF" w:fill="D9D9D9"/>
+          <w:lang w:val="en-IN"/>
+        </w:rPr>
+        <w:t>automatically restarts</w:t>
+      </w:r>
+      <w:r>
+        <w:rPr>
+          <w:rFonts w:hint="default" w:ascii="Bodoni MT" w:hAnsi="Bodoni MT" w:cs="Bodoni MT"/>
+          <w:b w:val="0"/>
+          <w:bCs w:val="0"/>
+          <w:i w:val="0"/>
+          <w:iCs w:val="0"/>
+          <w:color w:val="3B5F21" w:themeColor="accent4" w:themeShade="80"/>
+          <w:shd w:val="clear" w:color="FFFFFF" w:fill="D9D9D9"/>
+          <w:lang w:val="en-IN"/>
+        </w:rPr>
+        <w:t xml:space="preserve"> the pods by itself.</w:t>
       </w:r>
     </w:p>
     <w:p>
@@ -32837,6 +35061,60 @@
     </w:p>
     <w:p>
       <w:pPr>
+        <w:rPr>
+          <w:rFonts w:hint="default" w:ascii="Bodoni MT" w:hAnsi="Bodoni MT" w:cs="Bodoni MT"/>
+        </w:rPr>
+      </w:pPr>
+      <w:r>
+        <w:rPr>
+          <w:rFonts w:hint="default" w:ascii="Bodoni MT" w:hAnsi="Bodoni MT" w:cs="Bodoni MT"/>
+          <w:lang w:val="en-IN"/>
+        </w:rPr>
+        <w:br w:type="page"/>
+      </w:r>
+    </w:p>
+    <w:p>
+      <w:pPr>
+        <w:keepNext w:val="0"/>
+        <w:keepLines w:val="0"/>
+        <w:widowControl/>
+        <w:suppressLineNumbers w:val="0"/>
+        <w:spacing w:before="0" w:beforeAutospacing="0" w:after="0" w:afterAutospacing="0" w:line="360" w:lineRule="auto"/>
+        <w:ind w:left="0" w:leftChars="0" w:right="0" w:rightChars="0"/>
+        <w:jc w:val="center"/>
+        <w:rPr>
+          <w:rFonts w:hint="default" w:ascii="Bodoni MT" w:hAnsi="Bodoni MT" w:eastAsia="SimSun" w:cs="Bodoni MT"/>
+          <w:b/>
+          <w:bCs/>
+          <w:i/>
+          <w:iCs/>
+          <w:color w:val="002060"/>
+          <w:sz w:val="40"/>
+          <w:szCs w:val="40"/>
+          <w:highlight w:val="lightGray"/>
+          <w:u w:val="single"/>
+        </w:rPr>
+      </w:pPr>
+      <w:r>
+        <w:rPr>
+          <w:rFonts w:hint="default" w:ascii="Bodoni MT" w:hAnsi="Bodoni MT" w:eastAsia="SimSun" w:cs="Bodoni MT"/>
+          <w:b/>
+          <w:bCs/>
+          <w:i/>
+          <w:iCs/>
+          <w:color w:val="002060"/>
+          <w:kern w:val="0"/>
+          <w:sz w:val="40"/>
+          <w:szCs w:val="40"/>
+          <w:highlight w:val="lightGray"/>
+          <w:u w:val="single"/>
+          <w:lang w:val="en-US" w:eastAsia="zh-CN" w:bidi="ar"/>
+        </w:rPr>
+        <w:t>-----     Multiple Schedulers     -----</w:t>
+      </w:r>
+    </w:p>
+    <w:p>
+      <w:pPr>
         <w:keepNext w:val="0"/>
         <w:keepLines w:val="0"/>
         <w:widowControl/>
@@ -32857,7 +35135,462 @@
           <w:rFonts w:hint="default" w:ascii="Bodoni MT" w:hAnsi="Bodoni MT" w:cs="Bodoni MT"/>
           <w:lang w:val="en-IN"/>
         </w:rPr>
-        <w:t>F</w:t>
+        <w:t>There are 3 different files, that might be confusing but they are different.</w:t>
+      </w:r>
+    </w:p>
+    <w:p>
+      <w:pPr>
+        <w:keepNext w:val="0"/>
+        <w:keepLines w:val="0"/>
+        <w:widowControl/>
+        <w:numPr>
+          <w:ilvl w:val="1"/>
+          <w:numId w:val="11"/>
+        </w:numPr>
+        <w:suppressLineNumbers w:val="0"/>
+        <w:spacing w:before="0" w:beforeAutospacing="0" w:after="0" w:afterAutospacing="0" w:line="360" w:lineRule="auto"/>
+        <w:ind w:left="840" w:leftChars="0" w:right="0" w:hanging="420" w:firstLineChars="0"/>
+        <w:jc w:val="left"/>
+        <w:rPr>
+          <w:rFonts w:hint="default" w:ascii="Bodoni MT" w:hAnsi="Bodoni MT" w:cs="Bodoni MT"/>
+        </w:rPr>
+      </w:pPr>
+      <w:r>
+        <w:rPr>
+          <w:rFonts w:hint="default" w:ascii="Bodoni MT" w:hAnsi="Bodoni MT" w:cs="Bodoni MT"/>
+          <w:b/>
+          <w:bCs/>
+          <w:lang w:val="en-IN"/>
+        </w:rPr>
+        <w:t>kube-scheduler.yaml</w:t>
+      </w:r>
+      <w:r>
+        <w:rPr>
+          <w:rFonts w:hint="default" w:ascii="Bodoni MT" w:hAnsi="Bodoni MT" w:cs="Bodoni MT"/>
+          <w:b w:val="0"/>
+          <w:bCs w:val="0"/>
+          <w:lang w:val="en-IN"/>
+        </w:rPr>
+        <w:t xml:space="preserve"> </w:t>
+      </w:r>
+      <w:r>
+        <w:rPr>
+          <w:rFonts w:hint="default" w:ascii="Bodoni MT" w:hAnsi="Bodoni MT" w:cs="Bodoni MT"/>
+          <w:b w:val="0"/>
+          <w:bCs w:val="0"/>
+          <w:lang w:val="en-IN"/>
+        </w:rPr>
+        <w:br w:type="textWrapping"/>
+      </w:r>
+      <w:r>
+        <w:rPr>
+          <w:rFonts w:hint="default" w:ascii="Bodoni MT" w:hAnsi="Bodoni MT" w:cs="Bodoni MT"/>
+          <w:b w:val="0"/>
+          <w:bCs w:val="0"/>
+          <w:lang w:val="en-IN"/>
+        </w:rPr>
+        <w:t xml:space="preserve">present inside </w:t>
+      </w:r>
+      <w:r>
+        <w:rPr>
+          <w:rFonts w:hint="default" w:ascii="Bodoni MT" w:hAnsi="Bodoni MT" w:cs="Bodoni MT"/>
+          <w:b w:val="0"/>
+          <w:bCs w:val="0"/>
+          <w:i/>
+          <w:iCs/>
+          <w:lang w:val="en-IN"/>
+        </w:rPr>
+        <w:t>/etc/kubernetes/manifest</w:t>
+      </w:r>
+      <w:r>
+        <w:rPr>
+          <w:rFonts w:hint="default" w:ascii="Bodoni MT" w:hAnsi="Bodoni MT" w:cs="Bodoni MT"/>
+          <w:b w:val="0"/>
+          <w:bCs w:val="0"/>
+          <w:i w:val="0"/>
+          <w:iCs w:val="0"/>
+          <w:lang w:val="en-IN"/>
+        </w:rPr>
+        <w:t xml:space="preserve">   (Static Pod’s yaml)</w:t>
+      </w:r>
+    </w:p>
+    <w:p>
+      <w:pPr>
+        <w:keepNext w:val="0"/>
+        <w:keepLines w:val="0"/>
+        <w:widowControl/>
+        <w:numPr>
+          <w:ilvl w:val="1"/>
+          <w:numId w:val="11"/>
+        </w:numPr>
+        <w:suppressLineNumbers w:val="0"/>
+        <w:spacing w:before="0" w:beforeAutospacing="0" w:after="0" w:afterAutospacing="0" w:line="360" w:lineRule="auto"/>
+        <w:ind w:left="840" w:leftChars="0" w:right="0" w:hanging="420" w:firstLineChars="0"/>
+        <w:jc w:val="left"/>
+        <w:rPr>
+          <w:rFonts w:hint="default" w:ascii="Bodoni MT" w:hAnsi="Bodoni MT" w:cs="Bodoni MT"/>
+        </w:rPr>
+      </w:pPr>
+      <w:r>
+        <w:rPr>
+          <w:rFonts w:hint="default" w:ascii="Bodoni MT" w:hAnsi="Bodoni MT" w:cs="Bodoni MT"/>
+          <w:b/>
+          <w:bCs/>
+          <w:i w:val="0"/>
+          <w:iCs w:val="0"/>
+          <w:lang w:val="en-IN"/>
+        </w:rPr>
+        <w:t>scheduler.conf</w:t>
+      </w:r>
+      <w:r>
+        <w:rPr>
+          <w:rFonts w:hint="default" w:ascii="Bodoni MT" w:hAnsi="Bodoni MT" w:cs="Bodoni MT"/>
+          <w:b w:val="0"/>
+          <w:bCs w:val="0"/>
+          <w:i w:val="0"/>
+          <w:iCs w:val="0"/>
+          <w:lang w:val="en-IN"/>
+        </w:rPr>
+        <w:t xml:space="preserve"> </w:t>
+      </w:r>
+      <w:r>
+        <w:rPr>
+          <w:rFonts w:hint="default" w:ascii="Bodoni MT" w:hAnsi="Bodoni MT" w:cs="Bodoni MT"/>
+          <w:b w:val="0"/>
+          <w:bCs w:val="0"/>
+          <w:i w:val="0"/>
+          <w:iCs w:val="0"/>
+          <w:lang w:val="en-IN"/>
+        </w:rPr>
+        <w:br w:type="textWrapping"/>
+      </w:r>
+      <w:r>
+        <w:rPr>
+          <w:rFonts w:hint="default" w:ascii="Bodoni MT" w:hAnsi="Bodoni MT" w:cs="Bodoni MT"/>
+          <w:b w:val="0"/>
+          <w:bCs w:val="0"/>
+          <w:i w:val="0"/>
+          <w:iCs w:val="0"/>
+          <w:lang w:val="en-IN"/>
+        </w:rPr>
+        <w:t xml:space="preserve">kube-scheduler config file  (same structure as of </w:t>
+      </w:r>
+      <w:r>
+        <w:rPr>
+          <w:rFonts w:hint="default" w:ascii="Bodoni MT" w:hAnsi="Bodoni MT" w:cs="Bodoni MT"/>
+          <w:b w:val="0"/>
+          <w:bCs w:val="0"/>
+          <w:i w:val="0"/>
+          <w:iCs w:val="0"/>
+          <w:u w:val="single"/>
+          <w:lang w:val="en-IN"/>
+        </w:rPr>
+        <w:t>~/.kube/config</w:t>
+      </w:r>
+      <w:r>
+        <w:rPr>
+          <w:rFonts w:hint="default" w:ascii="Bodoni MT" w:hAnsi="Bodoni MT" w:cs="Bodoni MT"/>
+          <w:b w:val="0"/>
+          <w:bCs w:val="0"/>
+          <w:i w:val="0"/>
+          <w:iCs w:val="0"/>
+          <w:lang w:val="en-IN"/>
+        </w:rPr>
+        <w:t xml:space="preserve"> file)</w:t>
+      </w:r>
+    </w:p>
+    <w:p>
+      <w:pPr>
+        <w:keepNext w:val="0"/>
+        <w:keepLines w:val="0"/>
+        <w:widowControl/>
+        <w:numPr>
+          <w:ilvl w:val="1"/>
+          <w:numId w:val="11"/>
+        </w:numPr>
+        <w:suppressLineNumbers w:val="0"/>
+        <w:spacing w:before="0" w:beforeAutospacing="0" w:after="0" w:afterAutospacing="0" w:line="360" w:lineRule="auto"/>
+        <w:ind w:left="840" w:leftChars="0" w:right="0" w:hanging="420" w:firstLineChars="0"/>
+        <w:jc w:val="left"/>
+        <w:rPr>
+          <w:rFonts w:hint="default" w:ascii="Bodoni MT" w:hAnsi="Bodoni MT" w:cs="Bodoni MT"/>
+        </w:rPr>
+      </w:pPr>
+      <w:r>
+        <w:rPr>
+          <w:rFonts w:hint="default" w:ascii="Bodoni MT" w:hAnsi="Bodoni MT" w:cs="Bodoni MT"/>
+          <w:b/>
+          <w:bCs/>
+          <w:i w:val="0"/>
+          <w:iCs w:val="0"/>
+          <w:lang w:val="en-IN"/>
+        </w:rPr>
+        <w:t>scheduler-config.yaml</w:t>
+      </w:r>
+      <w:r>
+        <w:rPr>
+          <w:rFonts w:hint="default" w:ascii="Bodoni MT" w:hAnsi="Bodoni MT" w:cs="Bodoni MT"/>
+          <w:b w:val="0"/>
+          <w:bCs w:val="0"/>
+          <w:i w:val="0"/>
+          <w:iCs w:val="0"/>
+          <w:lang w:val="en-IN"/>
+        </w:rPr>
+        <w:t xml:space="preserve"> </w:t>
+      </w:r>
+      <w:r>
+        <w:rPr>
+          <w:rFonts w:hint="default" w:ascii="Bodoni MT" w:hAnsi="Bodoni MT" w:cs="Bodoni MT"/>
+          <w:b w:val="0"/>
+          <w:bCs w:val="0"/>
+          <w:i w:val="0"/>
+          <w:iCs w:val="0"/>
+          <w:lang w:val="en-IN"/>
+        </w:rPr>
+        <w:br w:type="textWrapping"/>
+      </w:r>
+      <w:r>
+        <w:rPr>
+          <w:rFonts w:hint="default" w:ascii="Bodoni MT" w:hAnsi="Bodoni MT" w:cs="Bodoni MT"/>
+          <w:b w:val="0"/>
+          <w:bCs w:val="0"/>
+          <w:i w:val="0"/>
+          <w:iCs w:val="0"/>
+          <w:lang w:val="en-IN"/>
+        </w:rPr>
+        <w:t xml:space="preserve">[ not same as </w:t>
+      </w:r>
+      <w:r>
+        <w:rPr>
+          <w:rFonts w:hint="default" w:ascii="Bodoni MT" w:hAnsi="Bodoni MT" w:cs="Bodoni MT"/>
+          <w:b w:val="0"/>
+          <w:bCs w:val="0"/>
+          <w:i/>
+          <w:iCs/>
+          <w:lang w:val="en-IN"/>
+        </w:rPr>
+        <w:t>scheduler.conf</w:t>
+      </w:r>
+      <w:r>
+        <w:rPr>
+          <w:rFonts w:hint="default" w:ascii="Bodoni MT" w:hAnsi="Bodoni MT" w:cs="Bodoni MT"/>
+          <w:b w:val="0"/>
+          <w:bCs w:val="0"/>
+          <w:i w:val="0"/>
+          <w:iCs w:val="0"/>
+          <w:lang w:val="en-IN"/>
+        </w:rPr>
+        <w:t xml:space="preserve"> ]</w:t>
+      </w:r>
+      <w:r>
+        <w:rPr>
+          <w:rFonts w:hint="default" w:ascii="Bodoni MT" w:hAnsi="Bodoni MT" w:cs="Bodoni MT"/>
+          <w:b w:val="0"/>
+          <w:bCs w:val="0"/>
+          <w:i w:val="0"/>
+          <w:iCs w:val="0"/>
+          <w:lang w:val="en-IN"/>
+        </w:rPr>
+        <w:br w:type="textWrapping"/>
+      </w:r>
+      <w:r>
+        <w:rPr>
+          <w:rFonts w:hint="default" w:ascii="Bodoni MT" w:hAnsi="Bodoni MT" w:cs="Bodoni MT"/>
+          <w:b w:val="0"/>
+          <w:bCs w:val="0"/>
+          <w:i w:val="0"/>
+          <w:iCs w:val="0"/>
+          <w:lang w:val="en-IN"/>
+        </w:rPr>
+        <w:t xml:space="preserve">it is the yaml file to create </w:t>
+      </w:r>
+      <w:r>
+        <w:rPr>
+          <w:rFonts w:hint="default" w:ascii="Bodoni MT" w:hAnsi="Bodoni MT" w:cs="Bodoni MT"/>
+          <w:b/>
+          <w:bCs/>
+          <w:i/>
+          <w:iCs/>
+          <w:color w:val="C65F10" w:themeColor="accent2" w:themeShade="BF"/>
+          <w:shd w:val="clear" w:color="FFFFFF" w:fill="D9D9D9"/>
+          <w:lang w:val="en-IN"/>
+        </w:rPr>
+        <w:t>KubeSchedulerConfiguration</w:t>
+      </w:r>
+      <w:r>
+        <w:rPr>
+          <w:rFonts w:hint="default" w:ascii="Bodoni MT" w:hAnsi="Bodoni MT" w:cs="Bodoni MT"/>
+          <w:b w:val="0"/>
+          <w:bCs w:val="0"/>
+          <w:i w:val="0"/>
+          <w:iCs w:val="0"/>
+          <w:lang w:val="en-IN"/>
+        </w:rPr>
+        <w:t xml:space="preserve"> resource.</w:t>
+      </w:r>
+      <w:r>
+        <w:rPr>
+          <w:rFonts w:hint="default" w:ascii="Bodoni MT" w:hAnsi="Bodoni MT" w:cs="Bodoni MT"/>
+          <w:b w:val="0"/>
+          <w:bCs w:val="0"/>
+          <w:i w:val="0"/>
+          <w:iCs w:val="0"/>
+          <w:lang w:val="en-IN"/>
+        </w:rPr>
+        <w:br w:type="textWrapping"/>
+      </w:r>
+      <w:r>
+        <w:rPr>
+          <w:rFonts w:hint="default" w:ascii="Bodoni MT" w:hAnsi="Bodoni MT" w:cs="Bodoni MT"/>
+        </w:rPr>
+        <w:drawing>
+          <wp:inline distT="0" distB="0" distL="114300" distR="114300">
+            <wp:extent cx="3155315" cy="829945"/>
+            <wp:effectExtent l="0" t="0" r="6985" b="8255"/>
+            <wp:docPr id="38" name="Picture 10"/>
+            <wp:cNvGraphicFramePr>
+              <a:graphicFrameLocks xmlns:a="http://schemas.openxmlformats.org/drawingml/2006/main" noChangeAspect="1"/>
+            </wp:cNvGraphicFramePr>
+            <a:graphic xmlns:a="http://schemas.openxmlformats.org/drawingml/2006/main">
+              <a:graphicData uri="http://schemas.openxmlformats.org/drawingml/2006/picture">
+                <pic:pic xmlns:pic="http://schemas.openxmlformats.org/drawingml/2006/picture">
+                  <pic:nvPicPr>
+                    <pic:cNvPr id="38" name="Picture 10"/>
+                    <pic:cNvPicPr>
+                      <a:picLocks noChangeAspect="1"/>
+                    </pic:cNvPicPr>
+                  </pic:nvPicPr>
+                  <pic:blipFill>
+                    <a:blip r:embed="rId109"/>
+                    <a:stretch>
+                      <a:fillRect/>
+                    </a:stretch>
+                  </pic:blipFill>
+                  <pic:spPr>
+                    <a:xfrm>
+                      <a:off x="0" y="0"/>
+                      <a:ext cx="3155315" cy="829945"/>
+                    </a:xfrm>
+                    <a:prstGeom prst="rect">
+                      <a:avLst/>
+                    </a:prstGeom>
+                    <a:noFill/>
+                    <a:ln>
+                      <a:noFill/>
+                    </a:ln>
+                  </pic:spPr>
+                </pic:pic>
+              </a:graphicData>
+            </a:graphic>
+          </wp:inline>
+        </w:drawing>
+      </w:r>
+    </w:p>
+    <w:p>
+      <w:pPr>
+        <w:keepNext w:val="0"/>
+        <w:keepLines w:val="0"/>
+        <w:widowControl/>
+        <w:numPr>
+          <w:ilvl w:val="1"/>
+          <w:numId w:val="11"/>
+        </w:numPr>
+        <w:suppressLineNumbers w:val="0"/>
+        <w:spacing w:before="0" w:beforeAutospacing="0" w:after="0" w:afterAutospacing="0" w:line="360" w:lineRule="auto"/>
+        <w:ind w:left="840" w:leftChars="0" w:right="0" w:hanging="420" w:firstLineChars="0"/>
+        <w:jc w:val="left"/>
+        <w:rPr>
+          <w:rFonts w:hint="default" w:ascii="Bodoni MT" w:hAnsi="Bodoni MT" w:cs="Bodoni MT"/>
+        </w:rPr>
+      </w:pPr>
+      <w:r>
+        <w:rPr>
+          <w:rFonts w:hint="default" w:ascii="Bodoni MT" w:hAnsi="Bodoni MT" w:cs="Bodoni MT"/>
+          <w:lang w:val="en-IN"/>
+        </w:rPr>
+        <w:t>In simple words:</w:t>
+      </w:r>
+      <w:r>
+        <w:rPr>
+          <w:rFonts w:hint="default" w:ascii="Bodoni MT" w:hAnsi="Bodoni MT" w:cs="Bodoni MT"/>
+          <w:lang w:val="en-IN"/>
+        </w:rPr>
+        <w:br w:type="textWrapping"/>
+      </w:r>
+      <w:r>
+        <w:rPr>
+          <w:rFonts w:hint="default" w:ascii="Bodoni MT" w:hAnsi="Bodoni MT" w:cs="Bodoni MT"/>
+          <w:i/>
+          <w:iCs/>
+          <w:u w:val="single"/>
+          <w:lang w:val="en-IN"/>
+        </w:rPr>
+        <w:t>kube-scheduler.yaml</w:t>
+      </w:r>
+      <w:r>
+        <w:rPr>
+          <w:rFonts w:hint="default" w:ascii="Bodoni MT" w:hAnsi="Bodoni MT" w:cs="Bodoni MT"/>
+          <w:i w:val="0"/>
+          <w:iCs w:val="0"/>
+          <w:lang w:val="en-IN"/>
+        </w:rPr>
+        <w:t xml:space="preserve"> creates the pod to run scheduler within it.</w:t>
+      </w:r>
+      <w:r>
+        <w:rPr>
+          <w:rFonts w:hint="default" w:ascii="Bodoni MT" w:hAnsi="Bodoni MT" w:cs="Bodoni MT"/>
+          <w:i w:val="0"/>
+          <w:iCs w:val="0"/>
+          <w:lang w:val="en-IN"/>
+        </w:rPr>
+        <w:br w:type="textWrapping"/>
+      </w:r>
+      <w:r>
+        <w:rPr>
+          <w:rFonts w:hint="default" w:ascii="Bodoni MT" w:hAnsi="Bodoni MT" w:cs="Bodoni MT"/>
+          <w:i/>
+          <w:iCs/>
+          <w:u w:val="single"/>
+          <w:lang w:val="en-IN"/>
+        </w:rPr>
+        <w:t>scheduler.conf</w:t>
+      </w:r>
+      <w:r>
+        <w:rPr>
+          <w:rFonts w:hint="default" w:ascii="Bodoni MT" w:hAnsi="Bodoni MT" w:cs="Bodoni MT"/>
+          <w:i w:val="0"/>
+          <w:iCs w:val="0"/>
+          <w:lang w:val="en-IN"/>
+        </w:rPr>
+        <w:t xml:space="preserve"> is the configuration file (details and certificates) for that scheduler.</w:t>
+      </w:r>
+      <w:r>
+        <w:rPr>
+          <w:rFonts w:hint="default" w:ascii="Bodoni MT" w:hAnsi="Bodoni MT" w:cs="Bodoni MT"/>
+          <w:i w:val="0"/>
+          <w:iCs w:val="0"/>
+          <w:lang w:val="en-IN"/>
+        </w:rPr>
+        <w:br w:type="textWrapping"/>
+      </w:r>
+      <w:r>
+        <w:rPr>
+          <w:rFonts w:hint="default" w:ascii="Bodoni MT" w:hAnsi="Bodoni MT" w:cs="Bodoni MT"/>
+          <w:i/>
+          <w:iCs/>
+          <w:u w:val="single"/>
+          <w:lang w:val="en-IN"/>
+        </w:rPr>
+        <w:t>scheduler-config.yaml</w:t>
+      </w:r>
+      <w:r>
+        <w:rPr>
+          <w:rFonts w:hint="default" w:ascii="Bodoni MT" w:hAnsi="Bodoni MT" w:cs="Bodoni MT"/>
+          <w:i w:val="0"/>
+          <w:iCs w:val="0"/>
+          <w:lang w:val="en-IN"/>
+        </w:rPr>
+        <w:t xml:space="preserve"> is the extra configuration plugins etc.</w:t>
       </w:r>
     </w:p>
     <w:p>
@@ -32882,8 +35615,611 @@
           <w:rFonts w:hint="default" w:ascii="Bodoni MT" w:hAnsi="Bodoni MT" w:cs="Bodoni MT"/>
           <w:lang w:val="en-IN"/>
         </w:rPr>
+        <w:t xml:space="preserve">When you open the </w:t>
+      </w:r>
+      <w:r>
+        <w:rPr>
+          <w:rFonts w:hint="default" w:ascii="Bodoni MT" w:hAnsi="Bodoni MT" w:cs="Bodoni MT"/>
+          <w:b/>
+          <w:bCs/>
+          <w:i/>
+          <w:iCs/>
+          <w:lang w:val="en-IN"/>
+        </w:rPr>
+        <w:t>kube-scheduler.yaml</w:t>
+      </w:r>
+      <w:r>
+        <w:rPr>
+          <w:rFonts w:hint="default" w:ascii="Bodoni MT" w:hAnsi="Bodoni MT" w:cs="Bodoni MT"/>
+          <w:b w:val="0"/>
+          <w:bCs w:val="0"/>
+          <w:i w:val="0"/>
+          <w:iCs w:val="0"/>
+          <w:lang w:val="en-IN"/>
+        </w:rPr>
+        <w:t xml:space="preserve">  (kind: Pod, where kube-scheduler runs), you’ll see a </w:t>
+      </w:r>
+      <w:r>
+        <w:rPr>
+          <w:rFonts w:hint="default" w:ascii="Bodoni MT" w:hAnsi="Bodoni MT" w:cs="Bodoni MT"/>
+          <w:b/>
+          <w:bCs/>
+          <w:i/>
+          <w:iCs/>
+          <w:lang w:val="en-IN"/>
+        </w:rPr>
+        <w:t>command</w:t>
+      </w:r>
+      <w:r>
+        <w:rPr>
+          <w:rFonts w:hint="default" w:ascii="Bodoni MT" w:hAnsi="Bodoni MT" w:cs="Bodoni MT"/>
+          <w:b w:val="0"/>
+          <w:bCs w:val="0"/>
+          <w:i w:val="0"/>
+          <w:iCs w:val="0"/>
+          <w:lang w:val="en-IN"/>
+        </w:rPr>
+        <w:t xml:space="preserve"> field (which is run inside the container).</w:t>
+      </w:r>
+    </w:p>
+    <w:p>
+      <w:pPr>
+        <w:keepNext w:val="0"/>
+        <w:keepLines w:val="0"/>
+        <w:widowControl/>
+        <w:numPr>
+          <w:ilvl w:val="1"/>
+          <w:numId w:val="11"/>
+        </w:numPr>
+        <w:suppressLineNumbers w:val="0"/>
+        <w:spacing w:before="0" w:beforeAutospacing="0" w:after="0" w:afterAutospacing="0" w:line="360" w:lineRule="auto"/>
+        <w:ind w:left="840" w:leftChars="0" w:right="0" w:hanging="420" w:firstLineChars="0"/>
+        <w:jc w:val="left"/>
+        <w:rPr>
+          <w:rFonts w:hint="default" w:ascii="Bodoni MT" w:hAnsi="Bodoni MT" w:cs="Bodoni MT"/>
+        </w:rPr>
+      </w:pPr>
+      <w:r>
+        <w:rPr>
+          <w:rFonts w:hint="default" w:ascii="Bodoni MT" w:hAnsi="Bodoni MT" w:cs="Bodoni MT"/>
+        </w:rPr>
+        <w:drawing>
+          <wp:inline distT="0" distB="0" distL="114300" distR="114300">
+            <wp:extent cx="3940810" cy="1504950"/>
+            <wp:effectExtent l="0" t="0" r="8890" b="6350"/>
+            <wp:docPr id="39" name="Picture 11"/>
+            <wp:cNvGraphicFramePr>
+              <a:graphicFrameLocks xmlns:a="http://schemas.openxmlformats.org/drawingml/2006/main" noChangeAspect="1"/>
+            </wp:cNvGraphicFramePr>
+            <a:graphic xmlns:a="http://schemas.openxmlformats.org/drawingml/2006/main">
+              <a:graphicData uri="http://schemas.openxmlformats.org/drawingml/2006/picture">
+                <pic:pic xmlns:pic="http://schemas.openxmlformats.org/drawingml/2006/picture">
+                  <pic:nvPicPr>
+                    <pic:cNvPr id="39" name="Picture 11"/>
+                    <pic:cNvPicPr>
+                      <a:picLocks noChangeAspect="1"/>
+                    </pic:cNvPicPr>
+                  </pic:nvPicPr>
+                  <pic:blipFill>
+                    <a:blip r:embed="rId110"/>
+                    <a:stretch>
+                      <a:fillRect/>
+                    </a:stretch>
+                  </pic:blipFill>
+                  <pic:spPr>
+                    <a:xfrm>
+                      <a:off x="0" y="0"/>
+                      <a:ext cx="3940810" cy="1504950"/>
+                    </a:xfrm>
+                    <a:prstGeom prst="rect">
+                      <a:avLst/>
+                    </a:prstGeom>
+                    <a:noFill/>
+                    <a:ln>
+                      <a:noFill/>
+                    </a:ln>
+                  </pic:spPr>
+                </pic:pic>
+              </a:graphicData>
+            </a:graphic>
+          </wp:inline>
+        </w:drawing>
+      </w:r>
+      <w:r>
+        <w:rPr>
+          <w:rFonts w:hint="default" w:ascii="Bodoni MT" w:hAnsi="Bodoni MT" w:cs="Bodoni MT"/>
+        </w:rPr>
+        <w:br w:type="textWrapping"/>
+      </w:r>
+      <w:r>
+        <w:rPr>
+          <w:rFonts w:hint="default" w:ascii="Bodoni MT" w:hAnsi="Bodoni MT" w:cs="Bodoni MT"/>
+          <w:lang w:val="en-IN"/>
+        </w:rPr>
+        <w:t xml:space="preserve">[ </w:t>
+      </w:r>
+      <w:r>
+        <w:rPr>
+          <w:rFonts w:hint="default" w:ascii="Bodoni MT" w:hAnsi="Bodoni MT" w:cs="Bodoni MT"/>
+          <w:b/>
+          <w:bCs/>
+          <w:lang w:val="en-IN"/>
+        </w:rPr>
+        <w:t>kube-scheduler</w:t>
+      </w:r>
+      <w:r>
+        <w:rPr>
+          <w:rFonts w:hint="default" w:ascii="Bodoni MT" w:hAnsi="Bodoni MT" w:cs="Bodoni MT"/>
+          <w:b w:val="0"/>
+          <w:bCs w:val="0"/>
+          <w:lang w:val="en-IN"/>
+        </w:rPr>
+        <w:t xml:space="preserve"> commands comes with that </w:t>
+      </w:r>
+      <w:r>
+        <w:rPr>
+          <w:rFonts w:hint="default" w:ascii="Bodoni MT" w:hAnsi="Bodoni MT" w:cs="Bodoni MT"/>
+          <w:b w:val="0"/>
+          <w:bCs w:val="0"/>
+          <w:i/>
+          <w:iCs/>
+          <w:lang w:val="en-IN"/>
+        </w:rPr>
+        <w:t>image</w:t>
+      </w:r>
+      <w:r>
+        <w:rPr>
+          <w:rFonts w:hint="default" w:ascii="Bodoni MT" w:hAnsi="Bodoni MT" w:cs="Bodoni MT"/>
+          <w:b w:val="0"/>
+          <w:bCs w:val="0"/>
+          <w:i w:val="0"/>
+          <w:iCs w:val="0"/>
+          <w:lang w:val="en-IN"/>
+        </w:rPr>
+        <w:t xml:space="preserve"> mentioned here ]</w:t>
+      </w:r>
+    </w:p>
+    <w:p>
+      <w:pPr>
+        <w:keepNext w:val="0"/>
+        <w:keepLines w:val="0"/>
+        <w:widowControl/>
+        <w:numPr>
+          <w:ilvl w:val="1"/>
+          <w:numId w:val="11"/>
+        </w:numPr>
+        <w:suppressLineNumbers w:val="0"/>
+        <w:spacing w:before="0" w:beforeAutospacing="0" w:after="0" w:afterAutospacing="0" w:line="360" w:lineRule="auto"/>
+        <w:ind w:left="840" w:leftChars="0" w:right="0" w:hanging="420" w:firstLineChars="0"/>
+        <w:jc w:val="left"/>
+        <w:rPr>
+          <w:rFonts w:hint="default" w:ascii="Bodoni MT" w:hAnsi="Bodoni MT" w:cs="Bodoni MT"/>
+        </w:rPr>
+      </w:pPr>
+      <w:r>
+        <w:rPr>
+          <w:rFonts w:hint="default" w:ascii="Bodoni MT" w:hAnsi="Bodoni MT" w:cs="Bodoni MT"/>
+          <w:lang w:val="en-IN"/>
+        </w:rPr>
+        <w:t xml:space="preserve">Here, the </w:t>
+      </w:r>
+      <w:r>
+        <w:rPr>
+          <w:rFonts w:hint="default" w:ascii="Bodoni MT" w:hAnsi="Bodoni MT" w:cs="Bodoni MT"/>
+          <w:b/>
+          <w:bCs/>
+          <w:i/>
+          <w:iCs/>
+          <w:lang w:val="en-IN"/>
+        </w:rPr>
+        <w:t>scheduler-config.yaml</w:t>
+      </w:r>
+      <w:r>
+        <w:rPr>
+          <w:rFonts w:hint="default" w:ascii="Bodoni MT" w:hAnsi="Bodoni MT" w:cs="Bodoni MT"/>
+          <w:b w:val="0"/>
+          <w:bCs w:val="0"/>
+          <w:i w:val="0"/>
+          <w:iCs w:val="0"/>
+          <w:lang w:val="en-IN"/>
+        </w:rPr>
+        <w:t xml:space="preserve"> is not mentioned, rather directly all the things are written here.</w:t>
+      </w:r>
+    </w:p>
+    <w:p>
+      <w:pPr>
+        <w:keepNext w:val="0"/>
+        <w:keepLines w:val="0"/>
+        <w:widowControl/>
+        <w:numPr>
+          <w:ilvl w:val="1"/>
+          <w:numId w:val="11"/>
+        </w:numPr>
+        <w:suppressLineNumbers w:val="0"/>
+        <w:spacing w:before="0" w:beforeAutospacing="0" w:after="0" w:afterAutospacing="0" w:line="360" w:lineRule="auto"/>
+        <w:ind w:left="840" w:leftChars="0" w:right="0" w:hanging="420" w:firstLineChars="0"/>
+        <w:jc w:val="left"/>
+        <w:rPr>
+          <w:rFonts w:hint="default" w:ascii="Bodoni MT" w:hAnsi="Bodoni MT" w:cs="Bodoni MT"/>
+        </w:rPr>
+      </w:pPr>
+      <w:r>
+        <w:rPr>
+          <w:rFonts w:hint="default" w:ascii="Bodoni MT" w:hAnsi="Bodoni MT" w:cs="Bodoni MT"/>
+          <w:b w:val="0"/>
+          <w:bCs w:val="0"/>
+          <w:i w:val="0"/>
+          <w:iCs w:val="0"/>
+          <w:lang w:val="en-IN"/>
+        </w:rPr>
+        <w:t xml:space="preserve">In modern way, </w:t>
+      </w:r>
+      <w:r>
+        <w:rPr>
+          <w:rFonts w:hint="default" w:ascii="Bodoni MT" w:hAnsi="Bodoni MT" w:cs="Bodoni MT"/>
+          <w:b/>
+          <w:bCs/>
+          <w:i/>
+          <w:iCs/>
+          <w:lang w:val="en-IN"/>
+        </w:rPr>
+        <w:t>scheduler-config.yaml</w:t>
+      </w:r>
+      <w:r>
+        <w:rPr>
+          <w:rFonts w:hint="default" w:ascii="Bodoni MT" w:hAnsi="Bodoni MT" w:cs="Bodoni MT"/>
+          <w:b w:val="0"/>
+          <w:bCs w:val="0"/>
+          <w:i w:val="0"/>
+          <w:iCs w:val="0"/>
+          <w:lang w:val="en-IN"/>
+        </w:rPr>
+        <w:t xml:space="preserve"> is present which is more proper.</w:t>
+      </w:r>
+      <w:r>
+        <w:rPr>
+          <w:rFonts w:hint="default" w:ascii="Bodoni MT" w:hAnsi="Bodoni MT" w:cs="Bodoni MT"/>
+          <w:b w:val="0"/>
+          <w:bCs w:val="0"/>
+          <w:i w:val="0"/>
+          <w:iCs w:val="0"/>
+          <w:lang w:val="en-IN"/>
+        </w:rPr>
+        <w:br w:type="textWrapping"/>
+      </w:r>
+      <w:r>
+        <w:rPr>
+          <w:rFonts w:hint="default" w:ascii="Bodoni MT" w:hAnsi="Bodoni MT" w:cs="Bodoni MT"/>
+        </w:rPr>
+        <w:drawing>
+          <wp:inline distT="0" distB="0" distL="114300" distR="114300">
+            <wp:extent cx="4069080" cy="1729105"/>
+            <wp:effectExtent l="0" t="0" r="7620" b="10795"/>
+            <wp:docPr id="41" name="Picture 13"/>
+            <wp:cNvGraphicFramePr>
+              <a:graphicFrameLocks xmlns:a="http://schemas.openxmlformats.org/drawingml/2006/main" noChangeAspect="1"/>
+            </wp:cNvGraphicFramePr>
+            <a:graphic xmlns:a="http://schemas.openxmlformats.org/drawingml/2006/main">
+              <a:graphicData uri="http://schemas.openxmlformats.org/drawingml/2006/picture">
+                <pic:pic xmlns:pic="http://schemas.openxmlformats.org/drawingml/2006/picture">
+                  <pic:nvPicPr>
+                    <pic:cNvPr id="41" name="Picture 13"/>
+                    <pic:cNvPicPr>
+                      <a:picLocks noChangeAspect="1"/>
+                    </pic:cNvPicPr>
+                  </pic:nvPicPr>
+                  <pic:blipFill>
+                    <a:blip r:embed="rId111"/>
+                    <a:stretch>
+                      <a:fillRect/>
+                    </a:stretch>
+                  </pic:blipFill>
+                  <pic:spPr>
+                    <a:xfrm>
+                      <a:off x="0" y="0"/>
+                      <a:ext cx="4069080" cy="1729105"/>
+                    </a:xfrm>
+                    <a:prstGeom prst="rect">
+                      <a:avLst/>
+                    </a:prstGeom>
+                    <a:noFill/>
+                    <a:ln>
+                      <a:noFill/>
+                    </a:ln>
+                  </pic:spPr>
+                </pic:pic>
+              </a:graphicData>
+            </a:graphic>
+          </wp:inline>
+        </w:drawing>
+      </w:r>
+      <w:r>
+        <w:rPr>
+          <w:rFonts w:hint="default" w:ascii="Bodoni MT" w:hAnsi="Bodoni MT" w:cs="Bodoni MT"/>
+        </w:rPr>
+        <w:br w:type="textWrapping"/>
+      </w:r>
+      <w:r>
+        <w:rPr>
+          <w:rFonts w:hint="default" w:ascii="Bodoni MT" w:hAnsi="Bodoni MT" w:cs="Bodoni MT"/>
+          <w:lang w:val="en-IN"/>
+        </w:rPr>
+        <w:t xml:space="preserve">[ the name would be </w:t>
+      </w:r>
+      <w:r>
+        <w:rPr>
+          <w:rFonts w:hint="default" w:ascii="Bodoni MT" w:hAnsi="Bodoni MT" w:cs="Bodoni MT"/>
+          <w:i/>
+          <w:iCs/>
+          <w:lang w:val="en-IN"/>
+        </w:rPr>
+        <w:t>scheduler-config.yaml</w:t>
+      </w:r>
+      <w:r>
+        <w:rPr>
+          <w:rFonts w:hint="default" w:ascii="Bodoni MT" w:hAnsi="Bodoni MT" w:cs="Bodoni MT"/>
+          <w:i w:val="0"/>
+          <w:iCs w:val="0"/>
+          <w:lang w:val="en-IN"/>
+        </w:rPr>
+        <w:t xml:space="preserve"> in case of default one ]</w:t>
+      </w:r>
+    </w:p>
+    <w:p>
+      <w:pPr>
+        <w:keepNext w:val="0"/>
+        <w:keepLines w:val="0"/>
+        <w:widowControl/>
+        <w:numPr>
+          <w:ilvl w:val="0"/>
+          <w:numId w:val="11"/>
+        </w:numPr>
+        <w:suppressLineNumbers w:val="0"/>
+        <w:spacing w:before="0" w:beforeAutospacing="0" w:after="0" w:afterAutospacing="0" w:line="360" w:lineRule="auto"/>
+        <w:ind w:left="420" w:leftChars="0" w:right="0" w:hanging="420" w:firstLineChars="0"/>
+        <w:jc w:val="left"/>
+        <w:rPr>
+          <w:rFonts w:hint="default" w:ascii="Bodoni MT" w:hAnsi="Bodoni MT" w:cs="Bodoni MT"/>
+        </w:rPr>
+      </w:pPr>
+      <w:r>
+        <w:rPr>
+          <w:rFonts w:hint="default" w:ascii="Bodoni MT" w:hAnsi="Bodoni MT" w:cs="Bodoni MT"/>
+          <w:lang w:val="en-IN"/>
+        </w:rPr>
+        <w:t xml:space="preserve">After creating your custom scheduler, you need to mention this explicitly inside Pod’s yaml file to choose the </w:t>
+      </w:r>
+      <w:r>
+        <w:rPr>
+          <w:rFonts w:hint="default" w:ascii="Bodoni MT" w:hAnsi="Bodoni MT" w:cs="Bodoni MT"/>
+          <w:i/>
+          <w:iCs/>
+          <w:lang w:val="en-IN"/>
+        </w:rPr>
+        <w:t>custom scheduler</w:t>
+      </w:r>
+      <w:r>
+        <w:rPr>
+          <w:rFonts w:hint="default" w:ascii="Bodoni MT" w:hAnsi="Bodoni MT" w:cs="Bodoni MT"/>
+          <w:i w:val="0"/>
+          <w:iCs w:val="0"/>
+          <w:lang w:val="en-IN"/>
+        </w:rPr>
+        <w:t xml:space="preserve"> instead of the default one.</w:t>
+      </w:r>
+      <w:r>
+        <w:rPr>
+          <w:rFonts w:hint="default" w:ascii="Bodoni MT" w:hAnsi="Bodoni MT" w:cs="Bodoni MT"/>
+          <w:i w:val="0"/>
+          <w:iCs w:val="0"/>
+          <w:lang w:val="en-IN"/>
+        </w:rPr>
+        <w:br w:type="textWrapping"/>
+      </w:r>
+      <w:r>
+        <w:drawing>
+          <wp:inline distT="0" distB="0" distL="114300" distR="114300">
+            <wp:extent cx="2760980" cy="1938655"/>
+            <wp:effectExtent l="0" t="0" r="7620" b="4445"/>
+            <wp:docPr id="22" name="Picture 1"/>
+            <wp:cNvGraphicFramePr>
+              <a:graphicFrameLocks xmlns:a="http://schemas.openxmlformats.org/drawingml/2006/main" noChangeAspect="1"/>
+            </wp:cNvGraphicFramePr>
+            <a:graphic xmlns:a="http://schemas.openxmlformats.org/drawingml/2006/main">
+              <a:graphicData uri="http://schemas.openxmlformats.org/drawingml/2006/picture">
+                <pic:pic xmlns:pic="http://schemas.openxmlformats.org/drawingml/2006/picture">
+                  <pic:nvPicPr>
+                    <pic:cNvPr id="22" name="Picture 1"/>
+                    <pic:cNvPicPr>
+                      <a:picLocks noChangeAspect="1"/>
+                    </pic:cNvPicPr>
+                  </pic:nvPicPr>
+                  <pic:blipFill>
+                    <a:blip r:embed="rId112"/>
+                    <a:stretch>
+                      <a:fillRect/>
+                    </a:stretch>
+                  </pic:blipFill>
+                  <pic:spPr>
+                    <a:xfrm>
+                      <a:off x="0" y="0"/>
+                      <a:ext cx="2760980" cy="1938655"/>
+                    </a:xfrm>
+                    <a:prstGeom prst="rect">
+                      <a:avLst/>
+                    </a:prstGeom>
+                    <a:noFill/>
+                    <a:ln>
+                      <a:noFill/>
+                    </a:ln>
+                  </pic:spPr>
+                </pic:pic>
+              </a:graphicData>
+            </a:graphic>
+          </wp:inline>
+        </w:drawing>
+      </w:r>
+    </w:p>
+    <w:p>
+      <w:pPr>
+        <w:keepNext w:val="0"/>
+        <w:keepLines w:val="0"/>
+        <w:widowControl/>
+        <w:numPr>
+          <w:ilvl w:val="0"/>
+          <w:numId w:val="11"/>
+        </w:numPr>
+        <w:suppressLineNumbers w:val="0"/>
+        <w:spacing w:before="0" w:beforeAutospacing="0" w:after="0" w:afterAutospacing="0" w:line="360" w:lineRule="auto"/>
+        <w:ind w:left="420" w:leftChars="0" w:right="0" w:hanging="420" w:firstLineChars="0"/>
+        <w:jc w:val="left"/>
+        <w:rPr>
+          <w:rFonts w:hint="default" w:ascii="Bodoni MT" w:hAnsi="Bodoni MT" w:cs="Bodoni MT"/>
+        </w:rPr>
+      </w:pPr>
+      <w:r>
+        <w:rPr>
+          <w:rFonts w:hint="default" w:ascii="Bodoni MT" w:hAnsi="Bodoni MT" w:cs="Bodoni MT"/>
+          <w:lang w:val="en-IN"/>
+        </w:rPr>
         <w:t>F</w:t>
       </w:r>
+    </w:p>
+    <w:p>
+      <w:pPr>
+        <w:keepNext w:val="0"/>
+        <w:keepLines w:val="0"/>
+        <w:widowControl/>
+        <w:numPr>
+          <w:ilvl w:val="0"/>
+          <w:numId w:val="11"/>
+        </w:numPr>
+        <w:suppressLineNumbers w:val="0"/>
+        <w:spacing w:before="0" w:beforeAutospacing="0" w:after="0" w:afterAutospacing="0" w:line="360" w:lineRule="auto"/>
+        <w:ind w:left="420" w:leftChars="0" w:right="0" w:hanging="420" w:firstLineChars="0"/>
+        <w:jc w:val="left"/>
+        <w:rPr>
+          <w:rFonts w:hint="default" w:ascii="Bodoni MT" w:hAnsi="Bodoni MT" w:cs="Bodoni MT"/>
+        </w:rPr>
+      </w:pPr>
+      <w:r>
+        <w:rPr>
+          <w:rFonts w:hint="default" w:ascii="Bodoni MT" w:hAnsi="Bodoni MT" w:cs="Bodoni MT"/>
+          <w:lang w:val="en-IN"/>
+        </w:rPr>
+        <w:t>F</w:t>
+      </w:r>
+    </w:p>
+    <w:p>
+      <w:pPr>
+        <w:keepNext w:val="0"/>
+        <w:keepLines w:val="0"/>
+        <w:widowControl/>
+        <w:numPr>
+          <w:ilvl w:val="0"/>
+          <w:numId w:val="11"/>
+        </w:numPr>
+        <w:suppressLineNumbers w:val="0"/>
+        <w:spacing w:before="0" w:beforeAutospacing="0" w:after="0" w:afterAutospacing="0" w:line="360" w:lineRule="auto"/>
+        <w:ind w:left="420" w:leftChars="0" w:right="0" w:hanging="420" w:firstLineChars="0"/>
+        <w:jc w:val="left"/>
+        <w:rPr>
+          <w:rFonts w:hint="default" w:ascii="Bodoni MT" w:hAnsi="Bodoni MT" w:cs="Bodoni MT"/>
+        </w:rPr>
+      </w:pPr>
+      <w:r>
+        <w:rPr>
+          <w:rFonts w:hint="default" w:ascii="Bodoni MT" w:hAnsi="Bodoni MT" w:cs="Bodoni MT"/>
+          <w:lang w:val="en-IN"/>
+        </w:rPr>
+        <w:t>F</w:t>
+      </w:r>
+    </w:p>
+    <w:p>
+      <w:pPr>
+        <w:keepNext w:val="0"/>
+        <w:keepLines w:val="0"/>
+        <w:widowControl/>
+        <w:numPr>
+          <w:ilvl w:val="0"/>
+          <w:numId w:val="11"/>
+        </w:numPr>
+        <w:suppressLineNumbers w:val="0"/>
+        <w:spacing w:before="0" w:beforeAutospacing="0" w:after="0" w:afterAutospacing="0" w:line="360" w:lineRule="auto"/>
+        <w:ind w:left="420" w:leftChars="0" w:right="0" w:hanging="420" w:firstLineChars="0"/>
+        <w:jc w:val="left"/>
+        <w:rPr>
+          <w:rFonts w:hint="default" w:ascii="Bodoni MT" w:hAnsi="Bodoni MT" w:cs="Bodoni MT"/>
+        </w:rPr>
+      </w:pPr>
+      <w:r>
+        <w:rPr>
+          <w:rFonts w:hint="default" w:ascii="Bodoni MT" w:hAnsi="Bodoni MT" w:cs="Bodoni MT"/>
+          <w:lang w:val="en-IN"/>
+        </w:rPr>
+        <w:t>F</w:t>
+      </w:r>
+    </w:p>
+    <w:p>
+      <w:pPr>
+        <w:keepNext w:val="0"/>
+        <w:keepLines w:val="0"/>
+        <w:widowControl/>
+        <w:numPr>
+          <w:ilvl w:val="0"/>
+          <w:numId w:val="11"/>
+        </w:numPr>
+        <w:suppressLineNumbers w:val="0"/>
+        <w:spacing w:before="0" w:beforeAutospacing="0" w:after="0" w:afterAutospacing="0" w:line="360" w:lineRule="auto"/>
+        <w:ind w:left="420" w:leftChars="0" w:right="0" w:hanging="420" w:firstLineChars="0"/>
+        <w:jc w:val="left"/>
+        <w:rPr>
+          <w:rFonts w:hint="default" w:ascii="Bodoni MT" w:hAnsi="Bodoni MT" w:cs="Bodoni MT"/>
+        </w:rPr>
+      </w:pPr>
+      <w:r>
+        <w:rPr>
+          <w:rFonts w:hint="default" w:ascii="Bodoni MT" w:hAnsi="Bodoni MT" w:cs="Bodoni MT"/>
+          <w:lang w:val="en-IN"/>
+        </w:rPr>
+        <w:t>F</w:t>
+      </w:r>
+    </w:p>
+    <w:p>
+      <w:pPr>
+        <w:keepNext w:val="0"/>
+        <w:keepLines w:val="0"/>
+        <w:widowControl/>
+        <w:numPr>
+          <w:ilvl w:val="0"/>
+          <w:numId w:val="11"/>
+        </w:numPr>
+        <w:suppressLineNumbers w:val="0"/>
+        <w:spacing w:before="0" w:beforeAutospacing="0" w:after="0" w:afterAutospacing="0" w:line="360" w:lineRule="auto"/>
+        <w:ind w:left="420" w:leftChars="0" w:right="0" w:hanging="420" w:firstLineChars="0"/>
+        <w:jc w:val="left"/>
+        <w:rPr>
+          <w:rFonts w:hint="default" w:ascii="Bodoni MT" w:hAnsi="Bodoni MT" w:cs="Bodoni MT"/>
+        </w:rPr>
+      </w:pPr>
+    </w:p>
+    <w:p>
+      <w:pPr>
+        <w:keepNext w:val="0"/>
+        <w:keepLines w:val="0"/>
+        <w:widowControl/>
+        <w:numPr>
+          <w:ilvl w:val="0"/>
+          <w:numId w:val="11"/>
+        </w:numPr>
+        <w:suppressLineNumbers w:val="0"/>
+        <w:spacing w:before="0" w:beforeAutospacing="0" w:after="0" w:afterAutospacing="0" w:line="360" w:lineRule="auto"/>
+        <w:ind w:left="420" w:leftChars="0" w:right="0" w:hanging="420" w:firstLineChars="0"/>
+        <w:jc w:val="left"/>
+        <w:rPr>
+          <w:rFonts w:hint="default" w:ascii="Bodoni MT" w:hAnsi="Bodoni MT" w:cs="Bodoni MT"/>
+        </w:rPr>
+      </w:pPr>
     </w:p>
     <w:p>
       <w:pPr>
@@ -33146,7 +36482,7 @@
                     </pic:cNvPicPr>
                   </pic:nvPicPr>
                   <pic:blipFill>
-                    <a:blip r:embed="rId104"/>
+                    <a:blip r:embed="rId113"/>
                     <a:stretch>
                       <a:fillRect/>
                     </a:stretch>
@@ -33353,7 +36689,7 @@
                     </pic:cNvPicPr>
                   </pic:nvPicPr>
                   <pic:blipFill>
-                    <a:blip r:embed="rId105"/>
+                    <a:blip r:embed="rId114"/>
                     <a:stretch>
                       <a:fillRect/>
                     </a:stretch>
@@ -33586,7 +36922,7 @@
                     </pic:cNvPicPr>
                   </pic:nvPicPr>
                   <pic:blipFill>
-                    <a:blip r:embed="rId106"/>
+                    <a:blip r:embed="rId115"/>
                     <a:stretch>
                       <a:fillRect/>
                     </a:stretch>
@@ -33694,7 +37030,7 @@
                     </pic:cNvPicPr>
                   </pic:nvPicPr>
                   <pic:blipFill>
-                    <a:blip r:embed="rId107"/>
+                    <a:blip r:embed="rId116"/>
                     <a:srcRect b="42801"/>
                     <a:stretch>
                       <a:fillRect/>
@@ -33935,7 +37271,7 @@
                     </pic:cNvPicPr>
                   </pic:nvPicPr>
                   <pic:blipFill>
-                    <a:blip r:embed="rId108"/>
+                    <a:blip r:embed="rId117"/>
                     <a:srcRect b="7377"/>
                     <a:stretch>
                       <a:fillRect/>
@@ -34000,7 +37336,7 @@
                     </pic:cNvPicPr>
                   </pic:nvPicPr>
                   <pic:blipFill>
-                    <a:blip r:embed="rId109"/>
+                    <a:blip r:embed="rId118"/>
                     <a:srcRect b="4847"/>
                     <a:stretch>
                       <a:fillRect/>
@@ -35838,8 +39174,6 @@
         </w:rPr>
         <w:t xml:space="preserve"> creates new container and the container ID is changed.</w:t>
       </w:r>
-      <w:bookmarkStart w:id="0" w:name="_GoBack"/>
-      <w:bookmarkEnd w:id="0"/>
     </w:p>
     <w:p>
       <w:pPr>
@@ -35986,12 +39320,48 @@
         <w:keepLines w:val="0"/>
         <w:widowControl/>
         <w:numPr>
-          <w:ilvl w:val="1"/>
+          <w:ilvl w:val="0"/>
           <w:numId w:val="11"/>
         </w:numPr>
         <w:suppressLineNumbers w:val="0"/>
         <w:spacing w:before="0" w:beforeAutospacing="0" w:after="0" w:afterAutospacing="0" w:line="360" w:lineRule="auto"/>
-        <w:ind w:left="840" w:leftChars="0" w:right="0" w:hanging="420" w:firstLineChars="0"/>
+        <w:ind w:left="420" w:leftChars="0" w:right="0" w:hanging="420" w:firstLineChars="0"/>
+        <w:jc w:val="left"/>
+        <w:rPr>
+          <w:rFonts w:hint="default" w:ascii="Bodoni MT" w:hAnsi="Bodoni MT" w:cs="Bodoni MT"/>
+        </w:rPr>
+      </w:pPr>
+      <w:r>
+        <w:rPr>
+          <w:rFonts w:hint="default" w:ascii="Bodoni MT" w:hAnsi="Bodoni MT" w:cs="Bodoni MT"/>
+          <w:i/>
+          <w:iCs/>
+          <w:lang w:val="en-IN"/>
+        </w:rPr>
+        <w:t>READ THE THEORY HAVING HEADING “Resources inside Pods vs Resources as normal Processes”</w:t>
+      </w:r>
+      <w:r>
+        <w:rPr>
+          <w:rFonts w:hint="default" w:ascii="Bodoni MT" w:hAnsi="Bodoni MT" w:cs="Bodoni MT"/>
+          <w:i w:val="0"/>
+          <w:iCs w:val="0"/>
+          <w:lang w:val="en-IN"/>
+        </w:rPr>
+        <w:t>; DON’T SKIP IT.</w:t>
+      </w:r>
+    </w:p>
+    <w:p>
+      <w:pPr>
+        <w:keepNext w:val="0"/>
+        <w:keepLines w:val="0"/>
+        <w:widowControl/>
+        <w:numPr>
+          <w:ilvl w:val="0"/>
+          <w:numId w:val="11"/>
+        </w:numPr>
+        <w:suppressLineNumbers w:val="0"/>
+        <w:spacing w:before="0" w:beforeAutospacing="0" w:after="0" w:afterAutospacing="0" w:line="360" w:lineRule="auto"/>
+        <w:ind w:left="420" w:leftChars="0" w:right="0" w:hanging="420" w:firstLineChars="0"/>
         <w:jc w:val="left"/>
         <w:rPr>
           <w:rFonts w:hint="default" w:ascii="Bodoni MT" w:hAnsi="Bodoni MT" w:cs="Bodoni MT"/>
@@ -36513,6 +39883,146 @@
     </w:lvl>
   </w:abstractNum>
   <w:abstractNum w:abstractNumId="3">
+    <w:nsid w:val="F3283FF0"/>
+    <w:multiLevelType w:val="multilevel"/>
+    <w:tmpl w:val="F3283FF0"/>
+    <w:lvl w:ilvl="0" w:tentative="0">
+      <w:start w:val="1"/>
+      <w:numFmt w:val="bullet"/>
+      <w:lvlText w:val=""/>
+      <w:lvlJc w:val="left"/>
+      <w:pPr>
+        <w:tabs>
+          <w:tab w:val="left" w:pos="420"/>
+        </w:tabs>
+        <w:ind w:left="420" w:hanging="420"/>
+      </w:pPr>
+      <w:rPr>
+        <w:rFonts w:hint="default" w:ascii="Wingdings" w:hAnsi="Wingdings" w:cs="Wingdings"/>
+      </w:rPr>
+    </w:lvl>
+    <w:lvl w:ilvl="1" w:tentative="0">
+      <w:start w:val="1"/>
+      <w:numFmt w:val="bullet"/>
+      <w:lvlText w:val="ﻤ"/>
+      <w:lvlJc w:val="left"/>
+      <w:pPr>
+        <w:tabs>
+          <w:tab w:val="left" w:pos="840"/>
+        </w:tabs>
+        <w:ind w:left="840" w:hanging="420"/>
+      </w:pPr>
+      <w:rPr>
+        <w:rFonts w:hint="default" w:ascii="Arial" w:hAnsi="Arial" w:cs="Arial"/>
+      </w:rPr>
+    </w:lvl>
+    <w:lvl w:ilvl="2" w:tentative="0">
+      <w:start w:val="1"/>
+      <w:numFmt w:val="bullet"/>
+      <w:lvlText w:val="ﺀ"/>
+      <w:lvlJc w:val="left"/>
+      <w:pPr>
+        <w:tabs>
+          <w:tab w:val="left" w:pos="1260"/>
+        </w:tabs>
+        <w:ind w:left="1260" w:hanging="420"/>
+      </w:pPr>
+      <w:rPr>
+        <w:rFonts w:hint="default" w:ascii="Arial" w:hAnsi="Arial" w:cs="Arial"/>
+      </w:rPr>
+    </w:lvl>
+    <w:lvl w:ilvl="3" w:tentative="0">
+      <w:start w:val="1"/>
+      <w:numFmt w:val="bullet"/>
+      <w:lvlText w:val="﮺"/>
+      <w:lvlJc w:val="left"/>
+      <w:pPr>
+        <w:tabs>
+          <w:tab w:val="left" w:pos="1680"/>
+        </w:tabs>
+        <w:ind w:left="1680" w:hanging="420"/>
+      </w:pPr>
+      <w:rPr>
+        <w:rFonts w:hint="default" w:ascii="Arial" w:hAnsi="Arial" w:cs="Arial"/>
+      </w:rPr>
+    </w:lvl>
+    <w:lvl w:ilvl="4" w:tentative="0">
+      <w:start w:val="1"/>
+      <w:numFmt w:val="bullet"/>
+      <w:lvlText w:val="꜠"/>
+      <w:lvlJc w:val="left"/>
+      <w:pPr>
+        <w:tabs>
+          <w:tab w:val="left" w:pos="2100"/>
+        </w:tabs>
+        <w:ind w:left="2100" w:hanging="420"/>
+      </w:pPr>
+      <w:rPr>
+        <w:rFonts w:hint="default" w:ascii="Arial" w:hAnsi="Arial" w:cs="Arial"/>
+      </w:rPr>
+    </w:lvl>
+    <w:lvl w:ilvl="5" w:tentative="0">
+      <w:start w:val="1"/>
+      <w:numFmt w:val="bullet"/>
+      <w:lvlText w:val="﯀"/>
+      <w:lvlJc w:val="left"/>
+      <w:pPr>
+        <w:tabs>
+          <w:tab w:val="left" w:pos="2520"/>
+        </w:tabs>
+        <w:ind w:left="2520" w:hanging="420"/>
+      </w:pPr>
+      <w:rPr>
+        <w:rFonts w:hint="default" w:ascii="Arial" w:hAnsi="Arial" w:cs="Arial"/>
+      </w:rPr>
+    </w:lvl>
+    <w:lvl w:ilvl="6" w:tentative="0">
+      <w:start w:val="1"/>
+      <w:numFmt w:val="bullet"/>
+      <w:lvlText w:val="͋"/>
+      <w:lvlJc w:val="left"/>
+      <w:pPr>
+        <w:tabs>
+          <w:tab w:val="left" w:pos="2940"/>
+        </w:tabs>
+        <w:ind w:left="2940" w:hanging="420"/>
+      </w:pPr>
+      <w:rPr>
+        <w:rFonts w:hint="default" w:ascii="Arial" w:hAnsi="Arial" w:cs="Arial"/>
+      </w:rPr>
+    </w:lvl>
+    <w:lvl w:ilvl="7" w:tentative="0">
+      <w:start w:val="1"/>
+      <w:numFmt w:val="bullet"/>
+      <w:lvlText w:val=""/>
+      <w:lvlJc w:val="left"/>
+      <w:pPr>
+        <w:tabs>
+          <w:tab w:val="left" w:pos="3360"/>
+        </w:tabs>
+        <w:ind w:left="3360" w:hanging="420"/>
+      </w:pPr>
+      <w:rPr>
+        <w:rFonts w:hint="default" w:ascii="Wingdings" w:hAnsi="Wingdings" w:cs="Wingdings"/>
+      </w:rPr>
+    </w:lvl>
+    <w:lvl w:ilvl="8" w:tentative="0">
+      <w:start w:val="1"/>
+      <w:numFmt w:val="bullet"/>
+      <w:lvlText w:val=""/>
+      <w:lvlJc w:val="left"/>
+      <w:pPr>
+        <w:tabs>
+          <w:tab w:val="left" w:pos="3780"/>
+        </w:tabs>
+        <w:ind w:left="3780" w:hanging="420"/>
+      </w:pPr>
+      <w:rPr>
+        <w:rFonts w:hint="default" w:ascii="Wingdings" w:hAnsi="Wingdings" w:cs="Wingdings"/>
+      </w:rPr>
+    </w:lvl>
+  </w:abstractNum>
+  <w:abstractNum w:abstractNumId="4">
     <w:nsid w:val="FFFFFF7C"/>
     <w:multiLevelType w:val="singleLevel"/>
     <w:tmpl w:val="FFFFFF7C"/>
@@ -36530,7 +40040,7 @@
       </w:pPr>
     </w:lvl>
   </w:abstractNum>
-  <w:abstractNum w:abstractNumId="4">
+  <w:abstractNum w:abstractNumId="5">
     <w:nsid w:val="FFFFFF7D"/>
     <w:multiLevelType w:val="singleLevel"/>
     <w:tmpl w:val="FFFFFF7D"/>
@@ -36548,7 +40058,7 @@
       </w:pPr>
     </w:lvl>
   </w:abstractNum>
-  <w:abstractNum w:abstractNumId="5">
+  <w:abstractNum w:abstractNumId="6">
     <w:nsid w:val="FFFFFF7E"/>
     <w:multiLevelType w:val="singleLevel"/>
     <w:tmpl w:val="FFFFFF7E"/>
@@ -36566,7 +40076,7 @@
       </w:pPr>
     </w:lvl>
   </w:abstractNum>
-  <w:abstractNum w:abstractNumId="6">
+  <w:abstractNum w:abstractNumId="7">
     <w:nsid w:val="FFFFFF7F"/>
     <w:multiLevelType w:val="singleLevel"/>
     <w:tmpl w:val="FFFFFF7F"/>
@@ -36584,7 +40094,7 @@
       </w:pPr>
     </w:lvl>
   </w:abstractNum>
-  <w:abstractNum w:abstractNumId="7">
+  <w:abstractNum w:abstractNumId="8">
     <w:nsid w:val="FFFFFF80"/>
     <w:multiLevelType w:val="singleLevel"/>
     <w:tmpl w:val="FFFFFF80"/>
@@ -36605,7 +40115,7 @@
       </w:rPr>
     </w:lvl>
   </w:abstractNum>
-  <w:abstractNum w:abstractNumId="8">
+  <w:abstractNum w:abstractNumId="9">
     <w:nsid w:val="FFFFFF81"/>
     <w:multiLevelType w:val="singleLevel"/>
     <w:tmpl w:val="FFFFFF81"/>
@@ -36626,7 +40136,7 @@
       </w:rPr>
     </w:lvl>
   </w:abstractNum>
-  <w:abstractNum w:abstractNumId="9">
+  <w:abstractNum w:abstractNumId="10">
     <w:nsid w:val="FFFFFF82"/>
     <w:multiLevelType w:val="singleLevel"/>
     <w:tmpl w:val="FFFFFF82"/>
@@ -36647,7 +40157,7 @@
       </w:rPr>
     </w:lvl>
   </w:abstractNum>
-  <w:abstractNum w:abstractNumId="10">
+  <w:abstractNum w:abstractNumId="11">
     <w:nsid w:val="FFFFFF83"/>
     <w:multiLevelType w:val="singleLevel"/>
     <w:tmpl w:val="FFFFFF83"/>
@@ -36668,7 +40178,7 @@
       </w:rPr>
     </w:lvl>
   </w:abstractNum>
-  <w:abstractNum w:abstractNumId="11">
+  <w:abstractNum w:abstractNumId="12">
     <w:nsid w:val="FFFFFF88"/>
     <w:multiLevelType w:val="singleLevel"/>
     <w:tmpl w:val="FFFFFF88"/>
@@ -36686,7 +40196,7 @@
       </w:pPr>
     </w:lvl>
   </w:abstractNum>
-  <w:abstractNum w:abstractNumId="12">
+  <w:abstractNum w:abstractNumId="13">
     <w:nsid w:val="FFFFFF89"/>
     <w:multiLevelType w:val="singleLevel"/>
     <w:tmpl w:val="FFFFFF89"/>
@@ -36707,7 +40217,7 @@
       </w:rPr>
     </w:lvl>
   </w:abstractNum>
-  <w:abstractNum w:abstractNumId="13">
+  <w:abstractNum w:abstractNumId="14">
     <w:nsid w:val="2C70F900"/>
     <w:multiLevelType w:val="multilevel"/>
     <w:tmpl w:val="2C70F900"/>
@@ -36848,34 +40358,34 @@
     </w:lvl>
   </w:abstractNum>
   <w:num w:numId="1">
+    <w:abstractNumId w:val="13"/>
+  </w:num>
+  <w:num w:numId="2">
+    <w:abstractNumId w:val="11"/>
+  </w:num>
+  <w:num w:numId="3">
+    <w:abstractNumId w:val="10"/>
+  </w:num>
+  <w:num w:numId="4">
+    <w:abstractNumId w:val="9"/>
+  </w:num>
+  <w:num w:numId="5">
+    <w:abstractNumId w:val="8"/>
+  </w:num>
+  <w:num w:numId="6">
     <w:abstractNumId w:val="12"/>
   </w:num>
-  <w:num w:numId="2">
-    <w:abstractNumId w:val="10"/>
-  </w:num>
-  <w:num w:numId="3">
-    <w:abstractNumId w:val="9"/>
-  </w:num>
-  <w:num w:numId="4">
-    <w:abstractNumId w:val="8"/>
-  </w:num>
-  <w:num w:numId="5">
+  <w:num w:numId="7">
     <w:abstractNumId w:val="7"/>
   </w:num>
-  <w:num w:numId="6">
-    <w:abstractNumId w:val="11"/>
-  </w:num>
-  <w:num w:numId="7">
+  <w:num w:numId="8">
     <w:abstractNumId w:val="6"/>
   </w:num>
-  <w:num w:numId="8">
+  <w:num w:numId="9">
     <w:abstractNumId w:val="5"/>
   </w:num>
-  <w:num w:numId="9">
+  <w:num w:numId="10">
     <w:abstractNumId w:val="4"/>
-  </w:num>
-  <w:num w:numId="10">
-    <w:abstractNumId w:val="3"/>
   </w:num>
   <w:num w:numId="11">
     <w:abstractNumId w:val="1"/>
@@ -36887,7 +40397,10 @@
     <w:abstractNumId w:val="0"/>
   </w:num>
   <w:num w:numId="14">
-    <w:abstractNumId w:val="13"/>
+    <w:abstractNumId w:val="14"/>
+  </w:num>
+  <w:num w:numId="15">
+    <w:abstractNumId w:val="3"/>
   </w:num>
 </w:numbering>
 </file>

</xml_diff>